<commit_message>
Adding Searching Topic & Update My QA Notes
</commit_message>
<xml_diff>
--- a/My-QA-Notes/The-Testing-Notes.docx
+++ b/My-QA-Notes/The-Testing-Notes.docx
@@ -1128,7 +1128,23 @@
                 <w:sz w:val="28"/>
                 <w:szCs w:val="28"/>
               </w:rPr>
-              <w:t>: When we have general functionalities like add payment, approve order, approve consignment, etc., match the feature with the status of the object.</w:t>
+              <w:t xml:space="preserve">: When we have general functionalities like add payment, approve order, approve consignment, etc., match the feature </w:t>
+            </w:r>
+            <w:r>
+              <w:rPr>
+                <w:rFonts w:ascii="Sakkal Majalla" w:hAnsi="Sakkal Majalla" w:cs="Sakkal Majalla"/>
+                <w:sz w:val="28"/>
+                <w:szCs w:val="28"/>
+              </w:rPr>
+              <w:t>to the object's status</w:t>
+            </w:r>
+            <w:r>
+              <w:rPr>
+                <w:rFonts w:ascii="Sakkal Majalla" w:hAnsi="Sakkal Majalla" w:cs="Sakkal Majalla"/>
+                <w:sz w:val="28"/>
+                <w:szCs w:val="28"/>
+              </w:rPr>
+              <w:t>.</w:t>
             </w:r>
           </w:p>
         </w:tc>
@@ -2621,7 +2637,25 @@
                 <w:sz w:val="28"/>
                 <w:szCs w:val="28"/>
               </w:rPr>
-              <w:t>The metafield columns for displaying, exporting,</w:t>
+              <w:t xml:space="preserve">The </w:t>
+            </w:r>
+            <w:proofErr w:type="spellStart"/>
+            <w:r>
+              <w:rPr>
+                <w:rFonts w:ascii="Sakkal Majalla" w:hAnsi="Sakkal Majalla" w:cs="Sakkal Majalla"/>
+                <w:sz w:val="28"/>
+                <w:szCs w:val="28"/>
+              </w:rPr>
+              <w:t>metafield</w:t>
+            </w:r>
+            <w:proofErr w:type="spellEnd"/>
+            <w:r>
+              <w:rPr>
+                <w:rFonts w:ascii="Sakkal Majalla" w:hAnsi="Sakkal Majalla" w:cs="Sakkal Majalla"/>
+                <w:sz w:val="28"/>
+                <w:szCs w:val="28"/>
+              </w:rPr>
+              <w:t xml:space="preserve"> columns for displaying, exporting,</w:t>
             </w:r>
             <w:r>
               <w:rPr>
@@ -3744,7 +3778,25 @@
                 <w:sz w:val="28"/>
                 <w:szCs w:val="28"/>
               </w:rPr>
-              <w:t>: The related metafield to the selected type, such as the bin-managed warehouses and their structure and tree.</w:t>
+              <w:t xml:space="preserve">: The related </w:t>
+            </w:r>
+            <w:proofErr w:type="spellStart"/>
+            <w:r>
+              <w:rPr>
+                <w:rFonts w:ascii="Sakkal Majalla" w:hAnsi="Sakkal Majalla" w:cs="Sakkal Majalla"/>
+                <w:sz w:val="28"/>
+                <w:szCs w:val="28"/>
+              </w:rPr>
+              <w:t>metafield</w:t>
+            </w:r>
+            <w:proofErr w:type="spellEnd"/>
+            <w:r>
+              <w:rPr>
+                <w:rFonts w:ascii="Sakkal Majalla" w:hAnsi="Sakkal Majalla" w:cs="Sakkal Majalla"/>
+                <w:sz w:val="28"/>
+                <w:szCs w:val="28"/>
+              </w:rPr>
+              <w:t xml:space="preserve"> to the selected type, such as the bin-managed warehouses and their structure and tree.</w:t>
             </w:r>
           </w:p>
         </w:tc>
@@ -7897,6 +7949,7 @@
               </w:rPr>
               <w:t xml:space="preserve">: When there are </w:t>
             </w:r>
+            <w:proofErr w:type="spellStart"/>
             <w:r>
               <w:rPr>
                 <w:rFonts w:ascii="Sakkal Majalla" w:hAnsi="Sakkal Majalla" w:cs="Sakkal Majalla"/>
@@ -7906,6 +7959,7 @@
               </w:rPr>
               <w:t>metafield</w:t>
             </w:r>
+            <w:proofErr w:type="spellEnd"/>
             <w:r>
               <w:rPr>
                 <w:rFonts w:ascii="Sakkal Majalla" w:hAnsi="Sakkal Majalla" w:cs="Sakkal Majalla"/>
@@ -8536,7 +8590,23 @@
                 <w:sz w:val="28"/>
                 <w:szCs w:val="28"/>
               </w:rPr>
-              <w:t>In the multi-currency systems check the currency object with the ISO code.</w:t>
+              <w:t xml:space="preserve">In the multi-currency </w:t>
+            </w:r>
+            <w:r>
+              <w:rPr>
+                <w:rFonts w:ascii="Sakkal Majalla" w:hAnsi="Sakkal Majalla" w:cs="Sakkal Majalla"/>
+                <w:sz w:val="28"/>
+                <w:szCs w:val="28"/>
+              </w:rPr>
+              <w:t>system,</w:t>
+            </w:r>
+            <w:r>
+              <w:rPr>
+                <w:rFonts w:ascii="Sakkal Majalla" w:hAnsi="Sakkal Majalla" w:cs="Sakkal Majalla"/>
+                <w:sz w:val="28"/>
+                <w:szCs w:val="28"/>
+              </w:rPr>
+              <w:t xml:space="preserve"> check the currency object with the ISO code.</w:t>
             </w:r>
           </w:p>
         </w:tc>
@@ -8572,7 +8642,25 @@
                 <w:sz w:val="28"/>
                 <w:szCs w:val="28"/>
               </w:rPr>
-              <w:t>The documents data.</w:t>
+              <w:t xml:space="preserve">The </w:t>
+            </w:r>
+            <w:r>
+              <w:rPr>
+                <w:rFonts w:ascii="Sakkal Majalla" w:hAnsi="Sakkal Majalla" w:cs="Sakkal Majalla"/>
+                <w:color w:val="auto"/>
+                <w:sz w:val="28"/>
+                <w:szCs w:val="28"/>
+              </w:rPr>
+              <w:t>document</w:t>
+            </w:r>
+            <w:r>
+              <w:rPr>
+                <w:rFonts w:ascii="Sakkal Majalla" w:hAnsi="Sakkal Majalla" w:cs="Sakkal Majalla"/>
+                <w:color w:val="auto"/>
+                <w:sz w:val="28"/>
+                <w:szCs w:val="28"/>
+              </w:rPr>
+              <w:t xml:space="preserve"> data.</w:t>
             </w:r>
           </w:p>
           <w:p>
@@ -8636,7 +8724,7 @@
             <w:pPr>
               <w:jc w:val="center"/>
               <w:rPr>
-                <w:rFonts w:ascii="Sakkal Majalla" w:hAnsi="Sakkal Majalla" w:cs="Sakkal Majalla" w:hint="cs"/>
+                <w:rFonts w:ascii="Sakkal Majalla" w:hAnsi="Sakkal Majalla" w:cs="Sakkal Majalla"/>
                 <w:color w:val="0070C0"/>
                 <w:sz w:val="28"/>
                 <w:szCs w:val="28"/>
@@ -8676,7 +8764,23 @@
                 <w:sz w:val="28"/>
                 <w:szCs w:val="28"/>
               </w:rPr>
-              <w:t>When we have multiple ways to create a content, we need to check the details, edit, change status, etc. forms for each way.</w:t>
+              <w:t>When we have multiple ways to create content, we need to check the details, edit, change status, etc.</w:t>
+            </w:r>
+            <w:r>
+              <w:rPr>
+                <w:rFonts w:ascii="Sakkal Majalla" w:hAnsi="Sakkal Majalla" w:cs="Sakkal Majalla"/>
+                <w:sz w:val="28"/>
+                <w:szCs w:val="28"/>
+              </w:rPr>
+              <w:t>,</w:t>
+            </w:r>
+            <w:r>
+              <w:rPr>
+                <w:rFonts w:ascii="Sakkal Majalla" w:hAnsi="Sakkal Majalla" w:cs="Sakkal Majalla"/>
+                <w:sz w:val="28"/>
+                <w:szCs w:val="28"/>
+              </w:rPr>
+              <w:t xml:space="preserve"> forms for each way.</w:t>
             </w:r>
           </w:p>
         </w:tc>
@@ -8714,7 +8818,2318 @@
                 <w:sz w:val="28"/>
                 <w:szCs w:val="28"/>
               </w:rPr>
-              <w:t>The user can create or genearte a skill using the AI, so we need to check the details and edit forms.</w:t>
+              <w:t xml:space="preserve">The user can create or </w:t>
+            </w:r>
+            <w:r>
+              <w:rPr>
+                <w:rFonts w:ascii="Sakkal Majalla" w:hAnsi="Sakkal Majalla" w:cs="Sakkal Majalla"/>
+                <w:color w:val="auto"/>
+                <w:sz w:val="28"/>
+                <w:szCs w:val="28"/>
+              </w:rPr>
+              <w:t>generate</w:t>
+            </w:r>
+            <w:r>
+              <w:rPr>
+                <w:rFonts w:ascii="Sakkal Majalla" w:hAnsi="Sakkal Majalla" w:cs="Sakkal Majalla"/>
+                <w:color w:val="auto"/>
+                <w:sz w:val="28"/>
+                <w:szCs w:val="28"/>
+              </w:rPr>
+              <w:t xml:space="preserve"> a skill using the AI, so we need to check the details and edit forms.</w:t>
+            </w:r>
+          </w:p>
+        </w:tc>
+      </w:tr>
+      <w:tr>
+        <w:trPr>
+          <w:cnfStyle w:val="000000100000" w:firstRow="0" w:lastRow="0" w:firstColumn="0" w:lastColumn="0" w:oddVBand="0" w:evenVBand="0" w:oddHBand="1" w:evenHBand="0" w:firstRowFirstColumn="0" w:firstRowLastColumn="0" w:lastRowFirstColumn="0" w:lastRowLastColumn="0"/>
+          <w:trHeight w:val="1214"/>
+        </w:trPr>
+        <w:tc>
+          <w:tcPr>
+            <w:cnfStyle w:val="001000000000" w:firstRow="0" w:lastRow="0" w:firstColumn="1" w:lastColumn="0" w:oddVBand="0" w:evenVBand="0" w:oddHBand="0" w:evenHBand="0" w:firstRowFirstColumn="0" w:firstRowLastColumn="0" w:lastRowFirstColumn="0" w:lastRowLastColumn="0"/>
+            <w:tcW w:w="651" w:type="dxa"/>
+          </w:tcPr>
+          <w:p>
+            <w:pPr>
+              <w:jc w:val="center"/>
+              <w:rPr>
+                <w:rFonts w:ascii="Sakkal Majalla" w:hAnsi="Sakkal Majalla" w:cs="Sakkal Majalla"/>
+                <w:color w:val="0070C0"/>
+                <w:sz w:val="28"/>
+                <w:szCs w:val="28"/>
+              </w:rPr>
+            </w:pPr>
+            <w:r>
+              <w:rPr>
+                <w:rFonts w:ascii="Sakkal Majalla" w:hAnsi="Sakkal Majalla" w:cs="Sakkal Majalla"/>
+                <w:color w:val="0070C0"/>
+                <w:sz w:val="28"/>
+                <w:szCs w:val="28"/>
+              </w:rPr>
+              <w:t>33</w:t>
+            </w:r>
+          </w:p>
+        </w:tc>
+        <w:tc>
+          <w:tcPr>
+            <w:tcW w:w="6522" w:type="dxa"/>
+          </w:tcPr>
+          <w:p>
+            <w:pPr>
+              <w:tabs>
+                <w:tab w:val="left" w:pos="1662"/>
+              </w:tabs>
+              <w:cnfStyle w:val="000000100000" w:firstRow="0" w:lastRow="0" w:firstColumn="0" w:lastColumn="0" w:oddVBand="0" w:evenVBand="0" w:oddHBand="1" w:evenHBand="0" w:firstRowFirstColumn="0" w:firstRowLastColumn="0" w:lastRowFirstColumn="0" w:lastRowLastColumn="0"/>
+              <w:rPr>
+                <w:rFonts w:ascii="Sakkal Majalla" w:hAnsi="Sakkal Majalla" w:cs="Sakkal Majalla"/>
+                <w:sz w:val="28"/>
+                <w:szCs w:val="28"/>
+              </w:rPr>
+            </w:pPr>
+            <w:r>
+              <w:rPr>
+                <w:rFonts w:ascii="Sakkal Majalla" w:hAnsi="Sakkal Majalla" w:cs="Sakkal Majalla"/>
+                <w:sz w:val="28"/>
+                <w:szCs w:val="28"/>
+              </w:rPr>
+              <w:t xml:space="preserve">When the user creates a document and </w:t>
+            </w:r>
+            <w:r>
+              <w:rPr>
+                <w:rFonts w:ascii="Sakkal Majalla" w:hAnsi="Sakkal Majalla" w:cs="Sakkal Majalla"/>
+                <w:sz w:val="28"/>
+                <w:szCs w:val="28"/>
+              </w:rPr>
+              <w:t>pays</w:t>
+            </w:r>
+            <w:r>
+              <w:rPr>
+                <w:rFonts w:ascii="Sakkal Majalla" w:hAnsi="Sakkal Majalla" w:cs="Sakkal Majalla"/>
+                <w:sz w:val="28"/>
+                <w:szCs w:val="28"/>
+              </w:rPr>
+              <w:t>, check the Journal Entry or the Financial effect of the payment.</w:t>
+            </w:r>
+          </w:p>
+        </w:tc>
+        <w:tc>
+          <w:tcPr>
+            <w:tcW w:w="4728" w:type="dxa"/>
+          </w:tcPr>
+          <w:p>
+            <w:pPr>
+              <w:cnfStyle w:val="000000100000" w:firstRow="0" w:lastRow="0" w:firstColumn="0" w:lastColumn="0" w:oddVBand="0" w:evenVBand="0" w:oddHBand="1" w:evenHBand="0" w:firstRowFirstColumn="0" w:firstRowLastColumn="0" w:lastRowFirstColumn="0" w:lastRowLastColumn="0"/>
+              <w:rPr>
+                <w:rFonts w:ascii="Sakkal Majalla" w:hAnsi="Sakkal Majalla" w:cs="Sakkal Majalla"/>
+                <w:b/>
+                <w:bCs/>
+                <w:color w:val="3A7C22" w:themeColor="accent6" w:themeShade="BF"/>
+                <w:sz w:val="28"/>
+                <w:szCs w:val="28"/>
+              </w:rPr>
+            </w:pPr>
+          </w:p>
+        </w:tc>
+      </w:tr>
+      <w:tr>
+        <w:trPr>
+          <w:trHeight w:val="1214"/>
+        </w:trPr>
+        <w:tc>
+          <w:tcPr>
+            <w:cnfStyle w:val="001000000000" w:firstRow="0" w:lastRow="0" w:firstColumn="1" w:lastColumn="0" w:oddVBand="0" w:evenVBand="0" w:oddHBand="0" w:evenHBand="0" w:firstRowFirstColumn="0" w:firstRowLastColumn="0" w:lastRowFirstColumn="0" w:lastRowLastColumn="0"/>
+            <w:tcW w:w="651" w:type="dxa"/>
+          </w:tcPr>
+          <w:p>
+            <w:pPr>
+              <w:jc w:val="center"/>
+              <w:rPr>
+                <w:rFonts w:ascii="Sakkal Majalla" w:hAnsi="Sakkal Majalla" w:cs="Sakkal Majalla"/>
+                <w:color w:val="0070C0"/>
+                <w:sz w:val="28"/>
+                <w:szCs w:val="28"/>
+              </w:rPr>
+            </w:pPr>
+            <w:r>
+              <w:rPr>
+                <w:rFonts w:ascii="Sakkal Majalla" w:hAnsi="Sakkal Majalla" w:cs="Sakkal Majalla"/>
+                <w:color w:val="0070C0"/>
+                <w:sz w:val="28"/>
+                <w:szCs w:val="28"/>
+              </w:rPr>
+              <w:t>34</w:t>
+            </w:r>
+          </w:p>
+        </w:tc>
+        <w:tc>
+          <w:tcPr>
+            <w:tcW w:w="6522" w:type="dxa"/>
+          </w:tcPr>
+          <w:p>
+            <w:pPr>
+              <w:tabs>
+                <w:tab w:val="left" w:pos="1662"/>
+              </w:tabs>
+              <w:cnfStyle w:val="000000000000" w:firstRow="0" w:lastRow="0" w:firstColumn="0" w:lastColumn="0" w:oddVBand="0" w:evenVBand="0" w:oddHBand="0" w:evenHBand="0" w:firstRowFirstColumn="0" w:firstRowLastColumn="0" w:lastRowFirstColumn="0" w:lastRowLastColumn="0"/>
+              <w:rPr>
+                <w:rFonts w:ascii="Sakkal Majalla" w:hAnsi="Sakkal Majalla" w:cs="Sakkal Majalla"/>
+                <w:sz w:val="28"/>
+                <w:szCs w:val="28"/>
+              </w:rPr>
+            </w:pPr>
+            <w:r>
+              <w:rPr>
+                <w:rFonts w:ascii="Sakkal Majalla" w:hAnsi="Sakkal Majalla" w:cs="Sakkal Majalla"/>
+                <w:sz w:val="28"/>
+                <w:szCs w:val="28"/>
+              </w:rPr>
+              <w:t>When the user uploads an attachment, image, document, etc., check the functionality of viewing, downloading, deleting, etc. for the uploaded one.</w:t>
+            </w:r>
+          </w:p>
+        </w:tc>
+        <w:tc>
+          <w:tcPr>
+            <w:tcW w:w="4728" w:type="dxa"/>
+          </w:tcPr>
+          <w:p>
+            <w:pPr>
+              <w:cnfStyle w:val="000000000000" w:firstRow="0" w:lastRow="0" w:firstColumn="0" w:lastColumn="0" w:oddVBand="0" w:evenVBand="0" w:oddHBand="0" w:evenHBand="0" w:firstRowFirstColumn="0" w:firstRowLastColumn="0" w:lastRowFirstColumn="0" w:lastRowLastColumn="0"/>
+              <w:rPr>
+                <w:rFonts w:ascii="Sakkal Majalla" w:hAnsi="Sakkal Majalla" w:cs="Sakkal Majalla"/>
+                <w:b/>
+                <w:bCs/>
+                <w:color w:val="3A7C22" w:themeColor="accent6" w:themeShade="BF"/>
+                <w:sz w:val="28"/>
+                <w:szCs w:val="28"/>
+              </w:rPr>
+            </w:pPr>
+          </w:p>
+        </w:tc>
+      </w:tr>
+      <w:tr>
+        <w:trPr>
+          <w:cnfStyle w:val="000000100000" w:firstRow="0" w:lastRow="0" w:firstColumn="0" w:lastColumn="0" w:oddVBand="0" w:evenVBand="0" w:oddHBand="1" w:evenHBand="0" w:firstRowFirstColumn="0" w:firstRowLastColumn="0" w:lastRowFirstColumn="0" w:lastRowLastColumn="0"/>
+          <w:trHeight w:val="1214"/>
+        </w:trPr>
+        <w:tc>
+          <w:tcPr>
+            <w:cnfStyle w:val="001000000000" w:firstRow="0" w:lastRow="0" w:firstColumn="1" w:lastColumn="0" w:oddVBand="0" w:evenVBand="0" w:oddHBand="0" w:evenHBand="0" w:firstRowFirstColumn="0" w:firstRowLastColumn="0" w:lastRowFirstColumn="0" w:lastRowLastColumn="0"/>
+            <w:tcW w:w="651" w:type="dxa"/>
+          </w:tcPr>
+          <w:p>
+            <w:pPr>
+              <w:jc w:val="center"/>
+              <w:rPr>
+                <w:rFonts w:ascii="Sakkal Majalla" w:hAnsi="Sakkal Majalla" w:cs="Sakkal Majalla"/>
+                <w:color w:val="0070C0"/>
+                <w:sz w:val="28"/>
+                <w:szCs w:val="28"/>
+              </w:rPr>
+            </w:pPr>
+            <w:r>
+              <w:rPr>
+                <w:rFonts w:ascii="Sakkal Majalla" w:hAnsi="Sakkal Majalla" w:cs="Sakkal Majalla"/>
+                <w:color w:val="0070C0"/>
+                <w:sz w:val="28"/>
+                <w:szCs w:val="28"/>
+              </w:rPr>
+              <w:t>35</w:t>
+            </w:r>
+          </w:p>
+        </w:tc>
+        <w:tc>
+          <w:tcPr>
+            <w:tcW w:w="6522" w:type="dxa"/>
+          </w:tcPr>
+          <w:p>
+            <w:pPr>
+              <w:tabs>
+                <w:tab w:val="left" w:pos="1662"/>
+              </w:tabs>
+              <w:cnfStyle w:val="000000100000" w:firstRow="0" w:lastRow="0" w:firstColumn="0" w:lastColumn="0" w:oddVBand="0" w:evenVBand="0" w:oddHBand="1" w:evenHBand="0" w:firstRowFirstColumn="0" w:firstRowLastColumn="0" w:lastRowFirstColumn="0" w:lastRowLastColumn="0"/>
+              <w:rPr>
+                <w:rFonts w:ascii="Sakkal Majalla" w:hAnsi="Sakkal Majalla" w:cs="Sakkal Majalla"/>
+                <w:sz w:val="28"/>
+                <w:szCs w:val="28"/>
+              </w:rPr>
+            </w:pPr>
+            <w:r>
+              <w:rPr>
+                <w:rFonts w:ascii="Sakkal Majalla" w:hAnsi="Sakkal Majalla" w:cs="Sakkal Majalla"/>
+                <w:sz w:val="28"/>
+                <w:szCs w:val="28"/>
+              </w:rPr>
+              <w:t>When the user cancels a document, e</w:t>
+            </w:r>
+            <w:r>
+              <w:rPr>
+                <w:rFonts w:ascii="Sakkal Majalla" w:hAnsi="Sakkal Majalla" w:cs="Sakkal Majalla"/>
+                <w:sz w:val="28"/>
+                <w:szCs w:val="28"/>
+              </w:rPr>
+              <w:t>xamine the financial entry corresponding to the document in question.</w:t>
+            </w:r>
+          </w:p>
+        </w:tc>
+        <w:tc>
+          <w:tcPr>
+            <w:tcW w:w="4728" w:type="dxa"/>
+          </w:tcPr>
+          <w:p>
+            <w:pPr>
+              <w:cnfStyle w:val="000000100000" w:firstRow="0" w:lastRow="0" w:firstColumn="0" w:lastColumn="0" w:oddVBand="0" w:evenVBand="0" w:oddHBand="1" w:evenHBand="0" w:firstRowFirstColumn="0" w:firstRowLastColumn="0" w:lastRowFirstColumn="0" w:lastRowLastColumn="0"/>
+              <w:rPr>
+                <w:rFonts w:ascii="Sakkal Majalla" w:hAnsi="Sakkal Majalla" w:cs="Sakkal Majalla"/>
+                <w:b/>
+                <w:bCs/>
+                <w:color w:val="3A7C22" w:themeColor="accent6" w:themeShade="BF"/>
+                <w:sz w:val="28"/>
+                <w:szCs w:val="28"/>
+              </w:rPr>
+            </w:pPr>
+          </w:p>
+        </w:tc>
+      </w:tr>
+      <w:tr>
+        <w:trPr>
+          <w:trHeight w:val="1214"/>
+        </w:trPr>
+        <w:tc>
+          <w:tcPr>
+            <w:cnfStyle w:val="001000000000" w:firstRow="0" w:lastRow="0" w:firstColumn="1" w:lastColumn="0" w:oddVBand="0" w:evenVBand="0" w:oddHBand="0" w:evenHBand="0" w:firstRowFirstColumn="0" w:firstRowLastColumn="0" w:lastRowFirstColumn="0" w:lastRowLastColumn="0"/>
+            <w:tcW w:w="651" w:type="dxa"/>
+          </w:tcPr>
+          <w:p>
+            <w:pPr>
+              <w:jc w:val="center"/>
+              <w:rPr>
+                <w:rFonts w:ascii="Sakkal Majalla" w:hAnsi="Sakkal Majalla" w:cs="Sakkal Majalla"/>
+                <w:color w:val="0070C0"/>
+                <w:sz w:val="28"/>
+                <w:szCs w:val="28"/>
+              </w:rPr>
+            </w:pPr>
+            <w:r>
+              <w:rPr>
+                <w:rFonts w:ascii="Sakkal Majalla" w:hAnsi="Sakkal Majalla" w:cs="Sakkal Majalla"/>
+                <w:color w:val="0070C0"/>
+                <w:sz w:val="28"/>
+                <w:szCs w:val="28"/>
+              </w:rPr>
+              <w:t>36</w:t>
+            </w:r>
+          </w:p>
+        </w:tc>
+        <w:tc>
+          <w:tcPr>
+            <w:tcW w:w="6522" w:type="dxa"/>
+          </w:tcPr>
+          <w:p>
+            <w:pPr>
+              <w:tabs>
+                <w:tab w:val="left" w:pos="1662"/>
+              </w:tabs>
+              <w:cnfStyle w:val="000000000000" w:firstRow="0" w:lastRow="0" w:firstColumn="0" w:lastColumn="0" w:oddVBand="0" w:evenVBand="0" w:oddHBand="0" w:evenHBand="0" w:firstRowFirstColumn="0" w:firstRowLastColumn="0" w:lastRowFirstColumn="0" w:lastRowLastColumn="0"/>
+              <w:rPr>
+                <w:rFonts w:ascii="Sakkal Majalla" w:hAnsi="Sakkal Majalla" w:cs="Sakkal Majalla"/>
+                <w:sz w:val="28"/>
+                <w:szCs w:val="28"/>
+              </w:rPr>
+            </w:pPr>
+            <w:r>
+              <w:rPr>
+                <w:rFonts w:ascii="Sakkal Majalla" w:hAnsi="Sakkal Majalla" w:cs="Sakkal Majalla"/>
+                <w:sz w:val="28"/>
+                <w:szCs w:val="28"/>
+              </w:rPr>
+              <w:t>When the user uses AI automation to scan docum</w:t>
+            </w:r>
+            <w:r>
+              <w:rPr>
+                <w:rFonts w:ascii="Sakkal Majalla" w:hAnsi="Sakkal Majalla" w:cs="Sakkal Majalla"/>
+                <w:sz w:val="28"/>
+                <w:szCs w:val="28"/>
+              </w:rPr>
+              <w:t>e</w:t>
+            </w:r>
+            <w:r>
+              <w:rPr>
+                <w:rFonts w:ascii="Sakkal Majalla" w:hAnsi="Sakkal Majalla" w:cs="Sakkal Majalla"/>
+                <w:sz w:val="28"/>
+                <w:szCs w:val="28"/>
+              </w:rPr>
+              <w:t>nts, check the prompt and the final result. Match the result with the current fields, and ask if we can add the missing fields or create them from the BE side.</w:t>
+            </w:r>
+          </w:p>
+        </w:tc>
+        <w:tc>
+          <w:tcPr>
+            <w:tcW w:w="4728" w:type="dxa"/>
+          </w:tcPr>
+          <w:p>
+            <w:pPr>
+              <w:cnfStyle w:val="000000000000" w:firstRow="0" w:lastRow="0" w:firstColumn="0" w:lastColumn="0" w:oddVBand="0" w:evenVBand="0" w:oddHBand="0" w:evenHBand="0" w:firstRowFirstColumn="0" w:firstRowLastColumn="0" w:lastRowFirstColumn="0" w:lastRowLastColumn="0"/>
+              <w:rPr>
+                <w:rFonts w:ascii="Sakkal Majalla" w:hAnsi="Sakkal Majalla" w:cs="Sakkal Majalla"/>
+                <w:b/>
+                <w:bCs/>
+                <w:color w:val="3A7C22" w:themeColor="accent6" w:themeShade="BF"/>
+                <w:sz w:val="28"/>
+                <w:szCs w:val="28"/>
+              </w:rPr>
+            </w:pPr>
+          </w:p>
+        </w:tc>
+      </w:tr>
+      <w:tr>
+        <w:trPr>
+          <w:cnfStyle w:val="000000100000" w:firstRow="0" w:lastRow="0" w:firstColumn="0" w:lastColumn="0" w:oddVBand="0" w:evenVBand="0" w:oddHBand="1" w:evenHBand="0" w:firstRowFirstColumn="0" w:firstRowLastColumn="0" w:lastRowFirstColumn="0" w:lastRowLastColumn="0"/>
+          <w:trHeight w:val="1214"/>
+        </w:trPr>
+        <w:tc>
+          <w:tcPr>
+            <w:cnfStyle w:val="001000000000" w:firstRow="0" w:lastRow="0" w:firstColumn="1" w:lastColumn="0" w:oddVBand="0" w:evenVBand="0" w:oddHBand="0" w:evenHBand="0" w:firstRowFirstColumn="0" w:firstRowLastColumn="0" w:lastRowFirstColumn="0" w:lastRowLastColumn="0"/>
+            <w:tcW w:w="651" w:type="dxa"/>
+          </w:tcPr>
+          <w:p>
+            <w:pPr>
+              <w:jc w:val="center"/>
+              <w:rPr>
+                <w:rFonts w:ascii="Sakkal Majalla" w:hAnsi="Sakkal Majalla" w:cs="Sakkal Majalla"/>
+                <w:color w:val="0070C0"/>
+                <w:sz w:val="28"/>
+                <w:szCs w:val="28"/>
+              </w:rPr>
+            </w:pPr>
+            <w:r>
+              <w:rPr>
+                <w:rFonts w:ascii="Sakkal Majalla" w:hAnsi="Sakkal Majalla" w:cs="Sakkal Majalla"/>
+                <w:color w:val="0070C0"/>
+                <w:sz w:val="28"/>
+                <w:szCs w:val="28"/>
+              </w:rPr>
+              <w:t>37</w:t>
+            </w:r>
+          </w:p>
+        </w:tc>
+        <w:tc>
+          <w:tcPr>
+            <w:tcW w:w="6522" w:type="dxa"/>
+          </w:tcPr>
+          <w:p>
+            <w:pPr>
+              <w:pStyle w:val="ListParagraph"/>
+              <w:numPr>
+                <w:ilvl w:val="0"/>
+                <w:numId w:val="4"/>
+              </w:numPr>
+              <w:tabs>
+                <w:tab w:val="left" w:pos="1662"/>
+              </w:tabs>
+              <w:cnfStyle w:val="000000100000" w:firstRow="0" w:lastRow="0" w:firstColumn="0" w:lastColumn="0" w:oddVBand="0" w:evenVBand="0" w:oddHBand="1" w:evenHBand="0" w:firstRowFirstColumn="0" w:firstRowLastColumn="0" w:lastRowFirstColumn="0" w:lastRowLastColumn="0"/>
+              <w:rPr>
+                <w:rFonts w:ascii="Sakkal Majalla" w:hAnsi="Sakkal Majalla" w:cs="Sakkal Majalla"/>
+                <w:sz w:val="28"/>
+                <w:szCs w:val="28"/>
+              </w:rPr>
+            </w:pPr>
+            <w:r>
+              <w:rPr>
+                <w:rFonts w:ascii="Sakkal Majalla" w:hAnsi="Sakkal Majalla" w:cs="Sakkal Majalla"/>
+                <w:sz w:val="28"/>
+                <w:szCs w:val="28"/>
+              </w:rPr>
+              <w:t xml:space="preserve">When we have a payment module that is related to </w:t>
+            </w:r>
+            <w:r>
+              <w:rPr>
+                <w:rFonts w:ascii="Sakkal Majalla" w:hAnsi="Sakkal Majalla" w:cs="Sakkal Majalla"/>
+                <w:sz w:val="28"/>
+                <w:szCs w:val="28"/>
+              </w:rPr>
+              <w:t xml:space="preserve">the </w:t>
+            </w:r>
+            <w:r>
+              <w:rPr>
+                <w:rFonts w:ascii="Sakkal Majalla" w:hAnsi="Sakkal Majalla" w:cs="Sakkal Majalla"/>
+                <w:sz w:val="28"/>
+                <w:szCs w:val="28"/>
+              </w:rPr>
+              <w:t xml:space="preserve">E-Commerce Documents module, we should check the paid amount </w:t>
+            </w:r>
+            <w:r>
+              <w:rPr>
+                <w:rFonts w:ascii="Sakkal Majalla" w:hAnsi="Sakkal Majalla" w:cs="Sakkal Majalla"/>
+                <w:sz w:val="28"/>
+                <w:szCs w:val="28"/>
+              </w:rPr>
+              <w:t>during</w:t>
+            </w:r>
+            <w:r>
+              <w:rPr>
+                <w:rFonts w:ascii="Sakkal Majalla" w:hAnsi="Sakkal Majalla" w:cs="Sakkal Majalla"/>
+                <w:sz w:val="28"/>
+                <w:szCs w:val="28"/>
+              </w:rPr>
+              <w:t xml:space="preserve"> reconciliation.</w:t>
+            </w:r>
+          </w:p>
+          <w:p>
+            <w:pPr>
+              <w:tabs>
+                <w:tab w:val="left" w:pos="1662"/>
+              </w:tabs>
+              <w:cnfStyle w:val="000000100000" w:firstRow="0" w:lastRow="0" w:firstColumn="0" w:lastColumn="0" w:oddVBand="0" w:evenVBand="0" w:oddHBand="1" w:evenHBand="0" w:firstRowFirstColumn="0" w:firstRowLastColumn="0" w:lastRowFirstColumn="0" w:lastRowLastColumn="0"/>
+              <w:rPr>
+                <w:rFonts w:ascii="Sakkal Majalla" w:hAnsi="Sakkal Majalla" w:cs="Sakkal Majalla"/>
+                <w:sz w:val="28"/>
+                <w:szCs w:val="28"/>
+              </w:rPr>
+            </w:pPr>
+          </w:p>
+          <w:p>
+            <w:pPr>
+              <w:pStyle w:val="ListParagraph"/>
+              <w:numPr>
+                <w:ilvl w:val="0"/>
+                <w:numId w:val="4"/>
+              </w:numPr>
+              <w:tabs>
+                <w:tab w:val="left" w:pos="1662"/>
+              </w:tabs>
+              <w:cnfStyle w:val="000000100000" w:firstRow="0" w:lastRow="0" w:firstColumn="0" w:lastColumn="0" w:oddVBand="0" w:evenVBand="0" w:oddHBand="1" w:evenHBand="0" w:firstRowFirstColumn="0" w:firstRowLastColumn="0" w:lastRowFirstColumn="0" w:lastRowLastColumn="0"/>
+              <w:rPr>
+                <w:rFonts w:ascii="Sakkal Majalla" w:hAnsi="Sakkal Majalla" w:cs="Sakkal Majalla"/>
+                <w:sz w:val="28"/>
+                <w:szCs w:val="28"/>
+              </w:rPr>
+            </w:pPr>
+            <w:r>
+              <w:rPr>
+                <w:rFonts w:ascii="Sakkal Majalla" w:hAnsi="Sakkal Majalla" w:cs="Sakkal Majalla"/>
+                <w:sz w:val="28"/>
+                <w:szCs w:val="28"/>
+              </w:rPr>
+              <w:t>We should check the Open Item or Remaining Open Amount.</w:t>
+            </w:r>
+          </w:p>
+          <w:p>
+            <w:pPr>
+              <w:tabs>
+                <w:tab w:val="left" w:pos="1662"/>
+              </w:tabs>
+              <w:cnfStyle w:val="000000100000" w:firstRow="0" w:lastRow="0" w:firstColumn="0" w:lastColumn="0" w:oddVBand="0" w:evenVBand="0" w:oddHBand="1" w:evenHBand="0" w:firstRowFirstColumn="0" w:firstRowLastColumn="0" w:lastRowFirstColumn="0" w:lastRowLastColumn="0"/>
+              <w:rPr>
+                <w:rFonts w:ascii="Sakkal Majalla" w:hAnsi="Sakkal Majalla" w:cs="Sakkal Majalla"/>
+                <w:sz w:val="28"/>
+                <w:szCs w:val="28"/>
+              </w:rPr>
+            </w:pPr>
+          </w:p>
+          <w:p>
+            <w:pPr>
+              <w:pStyle w:val="ListParagraph"/>
+              <w:numPr>
+                <w:ilvl w:val="0"/>
+                <w:numId w:val="4"/>
+              </w:numPr>
+              <w:tabs>
+                <w:tab w:val="left" w:pos="1662"/>
+              </w:tabs>
+              <w:cnfStyle w:val="000000100000" w:firstRow="0" w:lastRow="0" w:firstColumn="0" w:lastColumn="0" w:oddVBand="0" w:evenVBand="0" w:oddHBand="1" w:evenHBand="0" w:firstRowFirstColumn="0" w:firstRowLastColumn="0" w:lastRowFirstColumn="0" w:lastRowLastColumn="0"/>
+              <w:rPr>
+                <w:rFonts w:ascii="Sakkal Majalla" w:hAnsi="Sakkal Majalla" w:cs="Sakkal Majalla"/>
+                <w:sz w:val="28"/>
+                <w:szCs w:val="28"/>
+              </w:rPr>
+            </w:pPr>
+            <w:r>
+              <w:rPr>
+                <w:rFonts w:ascii="Sakkal Majalla" w:hAnsi="Sakkal Majalla" w:cs="Sakkal Majalla"/>
+                <w:sz w:val="28"/>
+                <w:szCs w:val="28"/>
+              </w:rPr>
+              <w:t xml:space="preserve">We should check the validation and permission rules for each employee </w:t>
+            </w:r>
+            <w:r>
+              <w:rPr>
+                <w:rFonts w:ascii="Sakkal Majalla" w:hAnsi="Sakkal Majalla" w:cs="Sakkal Majalla"/>
+                <w:sz w:val="28"/>
+                <w:szCs w:val="28"/>
+              </w:rPr>
+              <w:t xml:space="preserve">to see </w:t>
+            </w:r>
+            <w:r>
+              <w:rPr>
+                <w:rFonts w:ascii="Sakkal Majalla" w:hAnsi="Sakkal Majalla" w:cs="Sakkal Majalla"/>
+                <w:sz w:val="28"/>
+                <w:szCs w:val="28"/>
+              </w:rPr>
+              <w:t>if he/she can make the reconciliation with the remaining amount or not</w:t>
+            </w:r>
+            <w:r>
+              <w:rPr>
+                <w:rFonts w:ascii="Sakkal Majalla" w:hAnsi="Sakkal Majalla" w:cs="Sakkal Majalla"/>
+                <w:sz w:val="28"/>
+                <w:szCs w:val="28"/>
+              </w:rPr>
+              <w:t xml:space="preserve"> </w:t>
+            </w:r>
+            <w:r>
+              <w:rPr>
+                <w:rFonts w:ascii="Sakkal Majalla" w:hAnsi="Sakkal Majalla" w:cs="Sakkal Majalla"/>
+                <w:sz w:val="28"/>
+                <w:szCs w:val="28"/>
+              </w:rPr>
+              <w:t>(</w:t>
+            </w:r>
+            <w:r>
+              <w:rPr>
+                <w:rFonts w:ascii="Sakkal Majalla" w:hAnsi="Sakkal Majalla" w:cs="Sakkal Majalla"/>
+                <w:sz w:val="28"/>
+                <w:szCs w:val="28"/>
+              </w:rPr>
+              <w:t xml:space="preserve">refer to </w:t>
+            </w:r>
+            <w:r>
+              <w:rPr>
+                <w:rFonts w:ascii="Sakkal Majalla" w:hAnsi="Sakkal Majalla" w:cs="Sakkal Majalla"/>
+                <w:sz w:val="28"/>
+                <w:szCs w:val="28"/>
+              </w:rPr>
+              <w:t xml:space="preserve">the </w:t>
+            </w:r>
+            <w:r>
+              <w:rPr>
+                <w:rFonts w:ascii="Sakkal Majalla" w:hAnsi="Sakkal Majalla" w:cs="Sakkal Majalla"/>
+                <w:sz w:val="28"/>
+                <w:szCs w:val="28"/>
+              </w:rPr>
+              <w:t>chat file for more information</w:t>
+            </w:r>
+            <w:r>
+              <w:rPr>
+                <w:rFonts w:ascii="Sakkal Majalla" w:hAnsi="Sakkal Majalla" w:cs="Sakkal Majalla"/>
+                <w:sz w:val="28"/>
+                <w:szCs w:val="28"/>
+              </w:rPr>
+              <w:t>)</w:t>
+            </w:r>
+          </w:p>
+        </w:tc>
+        <w:tc>
+          <w:tcPr>
+            <w:tcW w:w="4728" w:type="dxa"/>
+          </w:tcPr>
+          <w:p>
+            <w:pPr>
+              <w:cnfStyle w:val="000000100000" w:firstRow="0" w:lastRow="0" w:firstColumn="0" w:lastColumn="0" w:oddVBand="0" w:evenVBand="0" w:oddHBand="1" w:evenHBand="0" w:firstRowFirstColumn="0" w:firstRowLastColumn="0" w:lastRowFirstColumn="0" w:lastRowLastColumn="0"/>
+              <w:rPr>
+                <w:rFonts w:ascii="Sakkal Majalla" w:hAnsi="Sakkal Majalla" w:cs="Sakkal Majalla"/>
+                <w:b/>
+                <w:bCs/>
+                <w:color w:val="3A7C22" w:themeColor="accent6" w:themeShade="BF"/>
+                <w:sz w:val="28"/>
+                <w:szCs w:val="28"/>
+              </w:rPr>
+            </w:pPr>
+          </w:p>
+        </w:tc>
+      </w:tr>
+      <w:tr>
+        <w:trPr>
+          <w:trHeight w:val="1214"/>
+        </w:trPr>
+        <w:tc>
+          <w:tcPr>
+            <w:cnfStyle w:val="001000000000" w:firstRow="0" w:lastRow="0" w:firstColumn="1" w:lastColumn="0" w:oddVBand="0" w:evenVBand="0" w:oddHBand="0" w:evenHBand="0" w:firstRowFirstColumn="0" w:firstRowLastColumn="0" w:lastRowFirstColumn="0" w:lastRowLastColumn="0"/>
+            <w:tcW w:w="651" w:type="dxa"/>
+          </w:tcPr>
+          <w:p>
+            <w:pPr>
+              <w:jc w:val="center"/>
+              <w:rPr>
+                <w:rFonts w:ascii="Sakkal Majalla" w:hAnsi="Sakkal Majalla" w:cs="Sakkal Majalla"/>
+                <w:color w:val="0070C0"/>
+                <w:sz w:val="28"/>
+                <w:szCs w:val="28"/>
+              </w:rPr>
+            </w:pPr>
+            <w:r>
+              <w:rPr>
+                <w:rFonts w:ascii="Sakkal Majalla" w:hAnsi="Sakkal Majalla" w:cs="Sakkal Majalla"/>
+                <w:color w:val="0070C0"/>
+                <w:sz w:val="28"/>
+                <w:szCs w:val="28"/>
+              </w:rPr>
+              <w:lastRenderedPageBreak/>
+              <w:t>38</w:t>
+            </w:r>
+          </w:p>
+        </w:tc>
+        <w:tc>
+          <w:tcPr>
+            <w:tcW w:w="6522" w:type="dxa"/>
+          </w:tcPr>
+          <w:p>
+            <w:pPr>
+              <w:tabs>
+                <w:tab w:val="left" w:pos="1662"/>
+              </w:tabs>
+              <w:cnfStyle w:val="000000000000" w:firstRow="0" w:lastRow="0" w:firstColumn="0" w:lastColumn="0" w:oddVBand="0" w:evenVBand="0" w:oddHBand="0" w:evenHBand="0" w:firstRowFirstColumn="0" w:firstRowLastColumn="0" w:lastRowFirstColumn="0" w:lastRowLastColumn="0"/>
+              <w:rPr>
+                <w:rFonts w:ascii="Sakkal Majalla" w:hAnsi="Sakkal Majalla" w:cs="Sakkal Majalla"/>
+                <w:sz w:val="28"/>
+                <w:szCs w:val="28"/>
+              </w:rPr>
+            </w:pPr>
+            <w:r>
+              <w:rPr>
+                <w:rFonts w:ascii="Sakkal Majalla" w:hAnsi="Sakkal Majalla" w:cs="Sakkal Majalla"/>
+                <w:sz w:val="28"/>
+                <w:szCs w:val="28"/>
+              </w:rPr>
+              <w:t>When handling e-commerce documents, check all the ways to create, edit, delete, etc., that make the application work.</w:t>
+            </w:r>
+          </w:p>
+        </w:tc>
+        <w:tc>
+          <w:tcPr>
+            <w:tcW w:w="4728" w:type="dxa"/>
+          </w:tcPr>
+          <w:p>
+            <w:pPr>
+              <w:cnfStyle w:val="000000000000" w:firstRow="0" w:lastRow="0" w:firstColumn="0" w:lastColumn="0" w:oddVBand="0" w:evenVBand="0" w:oddHBand="0" w:evenHBand="0" w:firstRowFirstColumn="0" w:firstRowLastColumn="0" w:lastRowFirstColumn="0" w:lastRowLastColumn="0"/>
+              <w:rPr>
+                <w:rFonts w:ascii="Sakkal Majalla" w:hAnsi="Sakkal Majalla" w:cs="Sakkal Majalla"/>
+                <w:color w:val="auto"/>
+                <w:sz w:val="28"/>
+                <w:szCs w:val="28"/>
+              </w:rPr>
+            </w:pPr>
+            <w:r>
+              <w:rPr>
+                <w:rFonts w:ascii="Sakkal Majalla" w:hAnsi="Sakkal Majalla" w:cs="Sakkal Majalla"/>
+                <w:b/>
+                <w:bCs/>
+                <w:color w:val="3A7C22" w:themeColor="accent6" w:themeShade="BF"/>
+                <w:sz w:val="28"/>
+                <w:szCs w:val="28"/>
+              </w:rPr>
+              <w:t xml:space="preserve">Ex-01: </w:t>
+            </w:r>
+            <w:r>
+              <w:rPr>
+                <w:rFonts w:ascii="Sakkal Majalla" w:hAnsi="Sakkal Majalla" w:cs="Sakkal Majalla"/>
+                <w:color w:val="auto"/>
+                <w:sz w:val="28"/>
+                <w:szCs w:val="28"/>
+              </w:rPr>
+              <w:t>If we want to remove a feature from the customer application, we can follow the main flow to check the full scenarios.</w:t>
+            </w:r>
+          </w:p>
+        </w:tc>
+      </w:tr>
+      <w:tr>
+        <w:trPr>
+          <w:cnfStyle w:val="000000100000" w:firstRow="0" w:lastRow="0" w:firstColumn="0" w:lastColumn="0" w:oddVBand="0" w:evenVBand="0" w:oddHBand="1" w:evenHBand="0" w:firstRowFirstColumn="0" w:firstRowLastColumn="0" w:lastRowFirstColumn="0" w:lastRowLastColumn="0"/>
+          <w:trHeight w:val="1214"/>
+        </w:trPr>
+        <w:tc>
+          <w:tcPr>
+            <w:cnfStyle w:val="001000000000" w:firstRow="0" w:lastRow="0" w:firstColumn="1" w:lastColumn="0" w:oddVBand="0" w:evenVBand="0" w:oddHBand="0" w:evenHBand="0" w:firstRowFirstColumn="0" w:firstRowLastColumn="0" w:lastRowFirstColumn="0" w:lastRowLastColumn="0"/>
+            <w:tcW w:w="651" w:type="dxa"/>
+          </w:tcPr>
+          <w:p>
+            <w:pPr>
+              <w:jc w:val="center"/>
+              <w:rPr>
+                <w:rFonts w:ascii="Sakkal Majalla" w:hAnsi="Sakkal Majalla" w:cs="Sakkal Majalla"/>
+                <w:color w:val="0070C0"/>
+                <w:sz w:val="28"/>
+                <w:szCs w:val="28"/>
+              </w:rPr>
+            </w:pPr>
+            <w:r>
+              <w:rPr>
+                <w:rFonts w:ascii="Sakkal Majalla" w:hAnsi="Sakkal Majalla" w:cs="Sakkal Majalla"/>
+                <w:color w:val="0070C0"/>
+                <w:sz w:val="28"/>
+                <w:szCs w:val="28"/>
+              </w:rPr>
+              <w:t>39</w:t>
+            </w:r>
+          </w:p>
+        </w:tc>
+        <w:tc>
+          <w:tcPr>
+            <w:tcW w:w="6522" w:type="dxa"/>
+          </w:tcPr>
+          <w:p>
+            <w:pPr>
+              <w:tabs>
+                <w:tab w:val="left" w:pos="1662"/>
+              </w:tabs>
+              <w:cnfStyle w:val="000000100000" w:firstRow="0" w:lastRow="0" w:firstColumn="0" w:lastColumn="0" w:oddVBand="0" w:evenVBand="0" w:oddHBand="1" w:evenHBand="0" w:firstRowFirstColumn="0" w:firstRowLastColumn="0" w:lastRowFirstColumn="0" w:lastRowLastColumn="0"/>
+              <w:rPr>
+                <w:rFonts w:ascii="Sakkal Majalla" w:hAnsi="Sakkal Majalla" w:cs="Sakkal Majalla"/>
+                <w:sz w:val="28"/>
+                <w:szCs w:val="28"/>
+              </w:rPr>
+            </w:pPr>
+            <w:r>
+              <w:rPr>
+                <w:rFonts w:ascii="Sakkal Majalla" w:hAnsi="Sakkal Majalla" w:cs="Sakkal Majalla"/>
+                <w:sz w:val="28"/>
+                <w:szCs w:val="28"/>
+              </w:rPr>
+              <w:t xml:space="preserve">Check the optional and auto-complete fields after resetting </w:t>
+            </w:r>
+            <w:r>
+              <w:rPr>
+                <w:rFonts w:ascii="Sakkal Majalla" w:hAnsi="Sakkal Majalla" w:cs="Sakkal Majalla"/>
+                <w:sz w:val="28"/>
+                <w:szCs w:val="28"/>
+              </w:rPr>
+              <w:t>them in create, edit, change status, change permission/s, etc.</w:t>
+            </w:r>
+          </w:p>
+        </w:tc>
+        <w:tc>
+          <w:tcPr>
+            <w:tcW w:w="4728" w:type="dxa"/>
+          </w:tcPr>
+          <w:p>
+            <w:pPr>
+              <w:cnfStyle w:val="000000100000" w:firstRow="0" w:lastRow="0" w:firstColumn="0" w:lastColumn="0" w:oddVBand="0" w:evenVBand="0" w:oddHBand="1" w:evenHBand="0" w:firstRowFirstColumn="0" w:firstRowLastColumn="0" w:lastRowFirstColumn="0" w:lastRowLastColumn="0"/>
+              <w:rPr>
+                <w:rFonts w:ascii="Sakkal Majalla" w:hAnsi="Sakkal Majalla" w:cs="Sakkal Majalla"/>
+                <w:color w:val="auto"/>
+                <w:sz w:val="28"/>
+                <w:szCs w:val="28"/>
+              </w:rPr>
+            </w:pPr>
+            <w:r>
+              <w:rPr>
+                <w:rFonts w:ascii="Sakkal Majalla" w:hAnsi="Sakkal Majalla" w:cs="Sakkal Majalla"/>
+                <w:b/>
+                <w:bCs/>
+                <w:color w:val="3A7C22" w:themeColor="accent6" w:themeShade="BF"/>
+                <w:sz w:val="28"/>
+                <w:szCs w:val="28"/>
+              </w:rPr>
+              <w:t xml:space="preserve">Ex-01: </w:t>
+            </w:r>
+            <w:r>
+              <w:rPr>
+                <w:rFonts w:ascii="Sakkal Majalla" w:hAnsi="Sakkal Majalla" w:cs="Sakkal Majalla"/>
+                <w:color w:val="auto"/>
+                <w:sz w:val="28"/>
+                <w:szCs w:val="28"/>
+              </w:rPr>
+              <w:t xml:space="preserve">Check the empty string fields </w:t>
+            </w:r>
+            <w:r>
+              <w:rPr>
+                <w:rFonts w:ascii="Sakkal Majalla" w:hAnsi="Sakkal Majalla" w:cs="Sakkal Majalla"/>
+                <w:color w:val="auto"/>
+                <w:sz w:val="28"/>
+                <w:szCs w:val="28"/>
+              </w:rPr>
+              <w:t>against</w:t>
+            </w:r>
+            <w:r>
+              <w:rPr>
+                <w:rFonts w:ascii="Sakkal Majalla" w:hAnsi="Sakkal Majalla" w:cs="Sakkal Majalla"/>
+                <w:color w:val="auto"/>
+                <w:sz w:val="28"/>
+                <w:szCs w:val="28"/>
+              </w:rPr>
+              <w:t xml:space="preserve"> the null values, such as the price list of the business entities.</w:t>
+            </w:r>
+          </w:p>
+        </w:tc>
+      </w:tr>
+      <w:tr>
+        <w:trPr>
+          <w:trHeight w:val="1214"/>
+        </w:trPr>
+        <w:tc>
+          <w:tcPr>
+            <w:cnfStyle w:val="001000000000" w:firstRow="0" w:lastRow="0" w:firstColumn="1" w:lastColumn="0" w:oddVBand="0" w:evenVBand="0" w:oddHBand="0" w:evenHBand="0" w:firstRowFirstColumn="0" w:firstRowLastColumn="0" w:lastRowFirstColumn="0" w:lastRowLastColumn="0"/>
+            <w:tcW w:w="651" w:type="dxa"/>
+          </w:tcPr>
+          <w:p>
+            <w:pPr>
+              <w:jc w:val="center"/>
+              <w:rPr>
+                <w:rFonts w:ascii="Sakkal Majalla" w:hAnsi="Sakkal Majalla" w:cs="Sakkal Majalla"/>
+                <w:color w:val="0070C0"/>
+                <w:sz w:val="28"/>
+                <w:szCs w:val="28"/>
+              </w:rPr>
+            </w:pPr>
+            <w:r>
+              <w:rPr>
+                <w:rFonts w:ascii="Sakkal Majalla" w:hAnsi="Sakkal Majalla" w:cs="Sakkal Majalla"/>
+                <w:color w:val="0070C0"/>
+                <w:sz w:val="28"/>
+                <w:szCs w:val="28"/>
+              </w:rPr>
+              <w:t>40</w:t>
+            </w:r>
+          </w:p>
+        </w:tc>
+        <w:tc>
+          <w:tcPr>
+            <w:tcW w:w="6522" w:type="dxa"/>
+          </w:tcPr>
+          <w:p>
+            <w:pPr>
+              <w:tabs>
+                <w:tab w:val="left" w:pos="1662"/>
+              </w:tabs>
+              <w:cnfStyle w:val="000000000000" w:firstRow="0" w:lastRow="0" w:firstColumn="0" w:lastColumn="0" w:oddVBand="0" w:evenVBand="0" w:oddHBand="0" w:evenHBand="0" w:firstRowFirstColumn="0" w:firstRowLastColumn="0" w:lastRowFirstColumn="0" w:lastRowLastColumn="0"/>
+              <w:rPr>
+                <w:rFonts w:ascii="Sakkal Majalla" w:hAnsi="Sakkal Majalla" w:cs="Sakkal Majalla"/>
+                <w:sz w:val="28"/>
+                <w:szCs w:val="28"/>
+              </w:rPr>
+            </w:pPr>
+            <w:r>
+              <w:rPr>
+                <w:rFonts w:ascii="Sakkal Majalla" w:hAnsi="Sakkal Majalla" w:cs="Sakkal Majalla"/>
+                <w:sz w:val="28"/>
+                <w:szCs w:val="28"/>
+              </w:rPr>
+              <w:t>When handling Performance Testing &amp; Automation Testing of gaming applications, we should:</w:t>
+            </w:r>
+          </w:p>
+          <w:p>
+            <w:pPr>
+              <w:pStyle w:val="ListParagraph"/>
+              <w:numPr>
+                <w:ilvl w:val="0"/>
+                <w:numId w:val="5"/>
+              </w:numPr>
+              <w:tabs>
+                <w:tab w:val="left" w:pos="1662"/>
+              </w:tabs>
+              <w:cnfStyle w:val="000000000000" w:firstRow="0" w:lastRow="0" w:firstColumn="0" w:lastColumn="0" w:oddVBand="0" w:evenVBand="0" w:oddHBand="0" w:evenHBand="0" w:firstRowFirstColumn="0" w:firstRowLastColumn="0" w:lastRowFirstColumn="0" w:lastRowLastColumn="0"/>
+              <w:rPr>
+                <w:rFonts w:ascii="Sakkal Majalla" w:hAnsi="Sakkal Majalla" w:cs="Sakkal Majalla"/>
+                <w:sz w:val="28"/>
+                <w:szCs w:val="28"/>
+              </w:rPr>
+            </w:pPr>
+            <w:r>
+              <w:rPr>
+                <w:rFonts w:ascii="Sakkal Majalla" w:hAnsi="Sakkal Majalla" w:cs="Sakkal Majalla"/>
+                <w:sz w:val="28"/>
+                <w:szCs w:val="28"/>
+              </w:rPr>
+              <w:t>Simulate the player strategy.</w:t>
+            </w:r>
+          </w:p>
+          <w:p>
+            <w:pPr>
+              <w:pStyle w:val="ListParagraph"/>
+              <w:numPr>
+                <w:ilvl w:val="0"/>
+                <w:numId w:val="5"/>
+              </w:numPr>
+              <w:tabs>
+                <w:tab w:val="left" w:pos="1662"/>
+              </w:tabs>
+              <w:cnfStyle w:val="000000000000" w:firstRow="0" w:lastRow="0" w:firstColumn="0" w:lastColumn="0" w:oddVBand="0" w:evenVBand="0" w:oddHBand="0" w:evenHBand="0" w:firstRowFirstColumn="0" w:firstRowLastColumn="0" w:lastRowFirstColumn="0" w:lastRowLastColumn="0"/>
+              <w:rPr>
+                <w:rFonts w:ascii="Sakkal Majalla" w:hAnsi="Sakkal Majalla" w:cs="Sakkal Majalla"/>
+                <w:sz w:val="28"/>
+                <w:szCs w:val="28"/>
+              </w:rPr>
+            </w:pPr>
+            <w:r>
+              <w:rPr>
+                <w:rFonts w:ascii="Sakkal Majalla" w:hAnsi="Sakkal Majalla" w:cs="Sakkal Majalla"/>
+                <w:sz w:val="28"/>
+                <w:szCs w:val="28"/>
+              </w:rPr>
+              <w:t>Simulate the bot strategy.</w:t>
+            </w:r>
+          </w:p>
+          <w:p>
+            <w:pPr>
+              <w:pStyle w:val="ListParagraph"/>
+              <w:numPr>
+                <w:ilvl w:val="0"/>
+                <w:numId w:val="5"/>
+              </w:numPr>
+              <w:tabs>
+                <w:tab w:val="left" w:pos="1662"/>
+              </w:tabs>
+              <w:cnfStyle w:val="000000000000" w:firstRow="0" w:lastRow="0" w:firstColumn="0" w:lastColumn="0" w:oddVBand="0" w:evenVBand="0" w:oddHBand="0" w:evenHBand="0" w:firstRowFirstColumn="0" w:firstRowLastColumn="0" w:lastRowFirstColumn="0" w:lastRowLastColumn="0"/>
+              <w:rPr>
+                <w:rFonts w:ascii="Sakkal Majalla" w:hAnsi="Sakkal Majalla" w:cs="Sakkal Majalla"/>
+                <w:sz w:val="28"/>
+                <w:szCs w:val="28"/>
+              </w:rPr>
+            </w:pPr>
+            <w:r>
+              <w:rPr>
+                <w:rFonts w:ascii="Sakkal Majalla" w:hAnsi="Sakkal Majalla" w:cs="Sakkal Majalla"/>
+                <w:sz w:val="28"/>
+                <w:szCs w:val="28"/>
+              </w:rPr>
+              <w:t>Check</w:t>
+            </w:r>
+            <w:r>
+              <w:rPr>
+                <w:rFonts w:ascii="Sakkal Majalla" w:hAnsi="Sakkal Majalla" w:cs="Sakkal Majalla"/>
+                <w:sz w:val="28"/>
+                <w:szCs w:val="28"/>
+              </w:rPr>
+              <w:t xml:space="preserve"> all the available APIs of the game SDK.</w:t>
+            </w:r>
+          </w:p>
+          <w:p>
+            <w:pPr>
+              <w:pStyle w:val="ListParagraph"/>
+              <w:numPr>
+                <w:ilvl w:val="0"/>
+                <w:numId w:val="5"/>
+              </w:numPr>
+              <w:tabs>
+                <w:tab w:val="left" w:pos="1662"/>
+              </w:tabs>
+              <w:cnfStyle w:val="000000000000" w:firstRow="0" w:lastRow="0" w:firstColumn="0" w:lastColumn="0" w:oddVBand="0" w:evenVBand="0" w:oddHBand="0" w:evenHBand="0" w:firstRowFirstColumn="0" w:firstRowLastColumn="0" w:lastRowFirstColumn="0" w:lastRowLastColumn="0"/>
+              <w:rPr>
+                <w:rFonts w:ascii="Sakkal Majalla" w:hAnsi="Sakkal Majalla" w:cs="Sakkal Majalla"/>
+                <w:sz w:val="28"/>
+                <w:szCs w:val="28"/>
+              </w:rPr>
+            </w:pPr>
+            <w:r>
+              <w:rPr>
+                <w:rFonts w:ascii="Sakkal Majalla" w:hAnsi="Sakkal Majalla" w:cs="Sakkal Majalla"/>
+                <w:sz w:val="28"/>
+                <w:szCs w:val="28"/>
+              </w:rPr>
+              <w:t>Simulate slower networks.</w:t>
+            </w:r>
+          </w:p>
+          <w:p>
+            <w:pPr>
+              <w:pStyle w:val="ListParagraph"/>
+              <w:numPr>
+                <w:ilvl w:val="0"/>
+                <w:numId w:val="5"/>
+              </w:numPr>
+              <w:tabs>
+                <w:tab w:val="left" w:pos="1662"/>
+              </w:tabs>
+              <w:cnfStyle w:val="000000000000" w:firstRow="0" w:lastRow="0" w:firstColumn="0" w:lastColumn="0" w:oddVBand="0" w:evenVBand="0" w:oddHBand="0" w:evenHBand="0" w:firstRowFirstColumn="0" w:firstRowLastColumn="0" w:lastRowFirstColumn="0" w:lastRowLastColumn="0"/>
+              <w:rPr>
+                <w:rFonts w:ascii="Sakkal Majalla" w:hAnsi="Sakkal Majalla" w:cs="Sakkal Majalla"/>
+                <w:sz w:val="28"/>
+                <w:szCs w:val="28"/>
+              </w:rPr>
+            </w:pPr>
+            <w:r>
+              <w:rPr>
+                <w:rFonts w:ascii="Sakkal Majalla" w:hAnsi="Sakkal Majalla" w:cs="Sakkal Majalla"/>
+                <w:sz w:val="28"/>
+                <w:szCs w:val="28"/>
+              </w:rPr>
+              <w:t>Check the cached data &amp; graphics before and after testing.</w:t>
+            </w:r>
+          </w:p>
+          <w:p>
+            <w:pPr>
+              <w:pStyle w:val="ListParagraph"/>
+              <w:numPr>
+                <w:ilvl w:val="0"/>
+                <w:numId w:val="5"/>
+              </w:numPr>
+              <w:tabs>
+                <w:tab w:val="left" w:pos="1662"/>
+              </w:tabs>
+              <w:cnfStyle w:val="000000000000" w:firstRow="0" w:lastRow="0" w:firstColumn="0" w:lastColumn="0" w:oddVBand="0" w:evenVBand="0" w:oddHBand="0" w:evenHBand="0" w:firstRowFirstColumn="0" w:firstRowLastColumn="0" w:lastRowFirstColumn="0" w:lastRowLastColumn="0"/>
+              <w:rPr>
+                <w:rFonts w:ascii="Sakkal Majalla" w:hAnsi="Sakkal Majalla" w:cs="Sakkal Majalla"/>
+                <w:sz w:val="28"/>
+                <w:szCs w:val="28"/>
+              </w:rPr>
+            </w:pPr>
+            <w:r>
+              <w:rPr>
+                <w:rFonts w:ascii="Sakkal Majalla" w:hAnsi="Sakkal Majalla" w:cs="Sakkal Majalla"/>
+                <w:sz w:val="28"/>
+                <w:szCs w:val="28"/>
+              </w:rPr>
+              <w:t>Test the statistical data of the game with screenshots</w:t>
+            </w:r>
+            <w:r>
+              <w:rPr>
+                <w:rFonts w:ascii="Sakkal Majalla" w:hAnsi="Sakkal Majalla" w:cs="Sakkal Majalla"/>
+                <w:sz w:val="28"/>
+                <w:szCs w:val="28"/>
+              </w:rPr>
+              <w:t>.</w:t>
+            </w:r>
+          </w:p>
+        </w:tc>
+        <w:tc>
+          <w:tcPr>
+            <w:tcW w:w="4728" w:type="dxa"/>
+          </w:tcPr>
+          <w:p>
+            <w:pPr>
+              <w:cnfStyle w:val="000000000000" w:firstRow="0" w:lastRow="0" w:firstColumn="0" w:lastColumn="0" w:oddVBand="0" w:evenVBand="0" w:oddHBand="0" w:evenHBand="0" w:firstRowFirstColumn="0" w:firstRowLastColumn="0" w:lastRowFirstColumn="0" w:lastRowLastColumn="0"/>
+              <w:rPr>
+                <w:rFonts w:ascii="Sakkal Majalla" w:hAnsi="Sakkal Majalla" w:cs="Sakkal Majalla"/>
+                <w:color w:val="auto"/>
+                <w:sz w:val="28"/>
+                <w:szCs w:val="28"/>
+              </w:rPr>
+            </w:pPr>
+            <w:r>
+              <w:rPr>
+                <w:rFonts w:ascii="Sakkal Majalla" w:hAnsi="Sakkal Majalla" w:cs="Sakkal Majalla"/>
+                <w:color w:val="auto"/>
+                <w:sz w:val="28"/>
+                <w:szCs w:val="28"/>
+              </w:rPr>
+              <w:t>Search for the state of testing mobile games for these situations:</w:t>
+            </w:r>
+          </w:p>
+          <w:p>
+            <w:pPr>
+              <w:pStyle w:val="ListParagraph"/>
+              <w:numPr>
+                <w:ilvl w:val="0"/>
+                <w:numId w:val="7"/>
+              </w:numPr>
+              <w:cnfStyle w:val="000000000000" w:firstRow="0" w:lastRow="0" w:firstColumn="0" w:lastColumn="0" w:oddVBand="0" w:evenVBand="0" w:oddHBand="0" w:evenHBand="0" w:firstRowFirstColumn="0" w:firstRowLastColumn="0" w:lastRowFirstColumn="0" w:lastRowLastColumn="0"/>
+              <w:rPr>
+                <w:rFonts w:ascii="Sakkal Majalla" w:hAnsi="Sakkal Majalla" w:cs="Sakkal Majalla"/>
+                <w:color w:val="auto"/>
+                <w:sz w:val="28"/>
+                <w:szCs w:val="28"/>
+              </w:rPr>
+            </w:pPr>
+            <w:r>
+              <w:rPr>
+                <w:rFonts w:ascii="Sakkal Majalla" w:hAnsi="Sakkal Majalla" w:cs="Sakkal Majalla"/>
+                <w:color w:val="auto"/>
+                <w:sz w:val="28"/>
+                <w:szCs w:val="28"/>
+              </w:rPr>
+              <w:t>Manual Testing.</w:t>
+            </w:r>
+          </w:p>
+          <w:p>
+            <w:pPr>
+              <w:pStyle w:val="ListParagraph"/>
+              <w:numPr>
+                <w:ilvl w:val="0"/>
+                <w:numId w:val="7"/>
+              </w:numPr>
+              <w:cnfStyle w:val="000000000000" w:firstRow="0" w:lastRow="0" w:firstColumn="0" w:lastColumn="0" w:oddVBand="0" w:evenVBand="0" w:oddHBand="0" w:evenHBand="0" w:firstRowFirstColumn="0" w:firstRowLastColumn="0" w:lastRowFirstColumn="0" w:lastRowLastColumn="0"/>
+              <w:rPr>
+                <w:rFonts w:ascii="Sakkal Majalla" w:hAnsi="Sakkal Majalla" w:cs="Sakkal Majalla"/>
+                <w:color w:val="auto"/>
+                <w:sz w:val="28"/>
+                <w:szCs w:val="28"/>
+              </w:rPr>
+            </w:pPr>
+            <w:r>
+              <w:rPr>
+                <w:rFonts w:ascii="Sakkal Majalla" w:hAnsi="Sakkal Majalla" w:cs="Sakkal Majalla"/>
+                <w:color w:val="auto"/>
+                <w:sz w:val="28"/>
+                <w:szCs w:val="28"/>
+              </w:rPr>
+              <w:t>Automation Testing.</w:t>
+            </w:r>
+          </w:p>
+          <w:p>
+            <w:pPr>
+              <w:pStyle w:val="ListParagraph"/>
+              <w:numPr>
+                <w:ilvl w:val="0"/>
+                <w:numId w:val="7"/>
+              </w:numPr>
+              <w:cnfStyle w:val="000000000000" w:firstRow="0" w:lastRow="0" w:firstColumn="0" w:lastColumn="0" w:oddVBand="0" w:evenVBand="0" w:oddHBand="0" w:evenHBand="0" w:firstRowFirstColumn="0" w:firstRowLastColumn="0" w:lastRowFirstColumn="0" w:lastRowLastColumn="0"/>
+              <w:rPr>
+                <w:rFonts w:ascii="Sakkal Majalla" w:hAnsi="Sakkal Majalla" w:cs="Sakkal Majalla"/>
+                <w:color w:val="auto"/>
+                <w:sz w:val="28"/>
+                <w:szCs w:val="28"/>
+              </w:rPr>
+            </w:pPr>
+            <w:r>
+              <w:rPr>
+                <w:rFonts w:ascii="Sakkal Majalla" w:hAnsi="Sakkal Majalla" w:cs="Sakkal Majalla"/>
+                <w:color w:val="auto"/>
+                <w:sz w:val="28"/>
+                <w:szCs w:val="28"/>
+              </w:rPr>
+              <w:t>Performance Testing.</w:t>
+            </w:r>
+          </w:p>
+          <w:p>
+            <w:pPr>
+              <w:pStyle w:val="ListParagraph"/>
+              <w:numPr>
+                <w:ilvl w:val="0"/>
+                <w:numId w:val="7"/>
+              </w:numPr>
+              <w:cnfStyle w:val="000000000000" w:firstRow="0" w:lastRow="0" w:firstColumn="0" w:lastColumn="0" w:oddVBand="0" w:evenVBand="0" w:oddHBand="0" w:evenHBand="0" w:firstRowFirstColumn="0" w:firstRowLastColumn="0" w:lastRowFirstColumn="0" w:lastRowLastColumn="0"/>
+              <w:rPr>
+                <w:rFonts w:ascii="Sakkal Majalla" w:hAnsi="Sakkal Majalla" w:cs="Sakkal Majalla"/>
+                <w:color w:val="auto"/>
+                <w:sz w:val="28"/>
+                <w:szCs w:val="28"/>
+              </w:rPr>
+            </w:pPr>
+            <w:r>
+              <w:rPr>
+                <w:rFonts w:ascii="Sakkal Majalla" w:hAnsi="Sakkal Majalla" w:cs="Sakkal Majalla"/>
+                <w:color w:val="auto"/>
+                <w:sz w:val="28"/>
+                <w:szCs w:val="28"/>
+              </w:rPr>
+              <w:t>Simulate bots.</w:t>
+            </w:r>
+          </w:p>
+          <w:p>
+            <w:pPr>
+              <w:pStyle w:val="ListParagraph"/>
+              <w:numPr>
+                <w:ilvl w:val="0"/>
+                <w:numId w:val="7"/>
+              </w:numPr>
+              <w:cnfStyle w:val="000000000000" w:firstRow="0" w:lastRow="0" w:firstColumn="0" w:lastColumn="0" w:oddVBand="0" w:evenVBand="0" w:oddHBand="0" w:evenHBand="0" w:firstRowFirstColumn="0" w:firstRowLastColumn="0" w:lastRowFirstColumn="0" w:lastRowLastColumn="0"/>
+              <w:rPr>
+                <w:rFonts w:ascii="Sakkal Majalla" w:hAnsi="Sakkal Majalla" w:cs="Sakkal Majalla"/>
+                <w:color w:val="auto"/>
+                <w:sz w:val="28"/>
+                <w:szCs w:val="28"/>
+              </w:rPr>
+            </w:pPr>
+            <w:r>
+              <w:rPr>
+                <w:rFonts w:ascii="Sakkal Majalla" w:hAnsi="Sakkal Majalla" w:cs="Sakkal Majalla"/>
+                <w:color w:val="auto"/>
+                <w:sz w:val="28"/>
+                <w:szCs w:val="28"/>
+              </w:rPr>
+              <w:t>Building gaming bots.</w:t>
+            </w:r>
+          </w:p>
+          <w:p>
+            <w:pPr>
+              <w:pStyle w:val="ListParagraph"/>
+              <w:numPr>
+                <w:ilvl w:val="0"/>
+                <w:numId w:val="7"/>
+              </w:numPr>
+              <w:cnfStyle w:val="000000000000" w:firstRow="0" w:lastRow="0" w:firstColumn="0" w:lastColumn="0" w:oddVBand="0" w:evenVBand="0" w:oddHBand="0" w:evenHBand="0" w:firstRowFirstColumn="0" w:firstRowLastColumn="0" w:lastRowFirstColumn="0" w:lastRowLastColumn="0"/>
+              <w:rPr>
+                <w:rFonts w:ascii="Sakkal Majalla" w:hAnsi="Sakkal Majalla" w:cs="Sakkal Majalla"/>
+                <w:color w:val="auto"/>
+                <w:sz w:val="28"/>
+                <w:szCs w:val="28"/>
+              </w:rPr>
+            </w:pPr>
+            <w:r>
+              <w:rPr>
+                <w:rFonts w:ascii="Sakkal Majalla" w:hAnsi="Sakkal Majalla" w:cs="Sakkal Majalla"/>
+                <w:color w:val="auto"/>
+                <w:sz w:val="28"/>
+                <w:szCs w:val="28"/>
+              </w:rPr>
+              <w:t>Using game SDK.</w:t>
+            </w:r>
+          </w:p>
+          <w:p>
+            <w:pPr>
+              <w:pStyle w:val="ListParagraph"/>
+              <w:numPr>
+                <w:ilvl w:val="0"/>
+                <w:numId w:val="7"/>
+              </w:numPr>
+              <w:cnfStyle w:val="000000000000" w:firstRow="0" w:lastRow="0" w:firstColumn="0" w:lastColumn="0" w:oddVBand="0" w:evenVBand="0" w:oddHBand="0" w:evenHBand="0" w:firstRowFirstColumn="0" w:firstRowLastColumn="0" w:lastRowFirstColumn="0" w:lastRowLastColumn="0"/>
+              <w:rPr>
+                <w:rFonts w:ascii="Sakkal Majalla" w:hAnsi="Sakkal Majalla" w:cs="Sakkal Majalla"/>
+                <w:color w:val="auto"/>
+                <w:sz w:val="28"/>
+                <w:szCs w:val="28"/>
+              </w:rPr>
+            </w:pPr>
+            <w:r>
+              <w:rPr>
+                <w:rFonts w:ascii="Sakkal Majalla" w:hAnsi="Sakkal Majalla" w:cs="Sakkal Majalla"/>
+                <w:color w:val="auto"/>
+                <w:sz w:val="28"/>
+                <w:szCs w:val="28"/>
+              </w:rPr>
+              <w:t>All other related fields.</w:t>
+            </w:r>
+          </w:p>
+        </w:tc>
+      </w:tr>
+      <w:tr>
+        <w:trPr>
+          <w:cnfStyle w:val="000000100000" w:firstRow="0" w:lastRow="0" w:firstColumn="0" w:lastColumn="0" w:oddVBand="0" w:evenVBand="0" w:oddHBand="1" w:evenHBand="0" w:firstRowFirstColumn="0" w:firstRowLastColumn="0" w:lastRowFirstColumn="0" w:lastRowLastColumn="0"/>
+          <w:trHeight w:val="1214"/>
+        </w:trPr>
+        <w:tc>
+          <w:tcPr>
+            <w:cnfStyle w:val="001000000000" w:firstRow="0" w:lastRow="0" w:firstColumn="1" w:lastColumn="0" w:oddVBand="0" w:evenVBand="0" w:oddHBand="0" w:evenHBand="0" w:firstRowFirstColumn="0" w:firstRowLastColumn="0" w:lastRowFirstColumn="0" w:lastRowLastColumn="0"/>
+            <w:tcW w:w="651" w:type="dxa"/>
+          </w:tcPr>
+          <w:p>
+            <w:pPr>
+              <w:jc w:val="center"/>
+              <w:rPr>
+                <w:rFonts w:ascii="Sakkal Majalla" w:hAnsi="Sakkal Majalla" w:cs="Sakkal Majalla"/>
+                <w:color w:val="0070C0"/>
+                <w:sz w:val="28"/>
+                <w:szCs w:val="28"/>
+              </w:rPr>
+            </w:pPr>
+            <w:r>
+              <w:rPr>
+                <w:rFonts w:ascii="Sakkal Majalla" w:hAnsi="Sakkal Majalla" w:cs="Sakkal Majalla"/>
+                <w:color w:val="0070C0"/>
+                <w:sz w:val="28"/>
+                <w:szCs w:val="28"/>
+              </w:rPr>
+              <w:t>41</w:t>
+            </w:r>
+          </w:p>
+        </w:tc>
+        <w:tc>
+          <w:tcPr>
+            <w:tcW w:w="6522" w:type="dxa"/>
+          </w:tcPr>
+          <w:p>
+            <w:pPr>
+              <w:tabs>
+                <w:tab w:val="left" w:pos="1662"/>
+              </w:tabs>
+              <w:cnfStyle w:val="000000100000" w:firstRow="0" w:lastRow="0" w:firstColumn="0" w:lastColumn="0" w:oddVBand="0" w:evenVBand="0" w:oddHBand="1" w:evenHBand="0" w:firstRowFirstColumn="0" w:firstRowLastColumn="0" w:lastRowFirstColumn="0" w:lastRowLastColumn="0"/>
+              <w:rPr>
+                <w:rFonts w:ascii="Sakkal Majalla" w:hAnsi="Sakkal Majalla" w:cs="Sakkal Majalla"/>
+                <w:sz w:val="28"/>
+                <w:szCs w:val="28"/>
+              </w:rPr>
+            </w:pPr>
+            <w:r>
+              <w:rPr>
+                <w:rFonts w:ascii="Sakkal Majalla" w:hAnsi="Sakkal Majalla" w:cs="Sakkal Majalla"/>
+                <w:sz w:val="28"/>
+                <w:szCs w:val="28"/>
+              </w:rPr>
+              <w:t xml:space="preserve">When creating a communication channel, check </w:t>
+            </w:r>
+            <w:r>
+              <w:rPr>
+                <w:rFonts w:ascii="Sakkal Majalla" w:hAnsi="Sakkal Majalla" w:cs="Sakkal Majalla"/>
+                <w:sz w:val="28"/>
+                <w:szCs w:val="28"/>
+              </w:rPr>
+              <w:t>for</w:t>
+            </w:r>
+            <w:r>
+              <w:rPr>
+                <w:rFonts w:ascii="Sakkal Majalla" w:hAnsi="Sakkal Majalla" w:cs="Sakkal Majalla"/>
+                <w:sz w:val="28"/>
+                <w:szCs w:val="28"/>
+              </w:rPr>
+              <w:t xml:space="preserve"> duplication of the email and type, JSON configuration file &amp; type, etc.</w:t>
+            </w:r>
+          </w:p>
+        </w:tc>
+        <w:tc>
+          <w:tcPr>
+            <w:tcW w:w="4728" w:type="dxa"/>
+          </w:tcPr>
+          <w:p>
+            <w:pPr>
+              <w:cnfStyle w:val="000000100000" w:firstRow="0" w:lastRow="0" w:firstColumn="0" w:lastColumn="0" w:oddVBand="0" w:evenVBand="0" w:oddHBand="1" w:evenHBand="0" w:firstRowFirstColumn="0" w:firstRowLastColumn="0" w:lastRowFirstColumn="0" w:lastRowLastColumn="0"/>
+              <w:rPr>
+                <w:rFonts w:ascii="Sakkal Majalla" w:hAnsi="Sakkal Majalla" w:cs="Sakkal Majalla"/>
+                <w:sz w:val="28"/>
+                <w:szCs w:val="28"/>
+              </w:rPr>
+            </w:pPr>
+            <w:r>
+              <w:rPr>
+                <w:rFonts w:ascii="Sakkal Majalla" w:hAnsi="Sakkal Majalla" w:cs="Sakkal Majalla"/>
+                <w:b/>
+                <w:bCs/>
+                <w:color w:val="3A7C22" w:themeColor="accent6" w:themeShade="BF"/>
+                <w:sz w:val="28"/>
+                <w:szCs w:val="28"/>
+              </w:rPr>
+              <w:t>Ex-01</w:t>
+            </w:r>
+            <w:r>
+              <w:rPr>
+                <w:rFonts w:ascii="Sakkal Majalla" w:hAnsi="Sakkal Majalla" w:cs="Sakkal Majalla"/>
+                <w:sz w:val="28"/>
+                <w:szCs w:val="28"/>
+              </w:rPr>
+              <w:t>: The organization email address and the communication channel type.</w:t>
+            </w:r>
+          </w:p>
+        </w:tc>
+      </w:tr>
+      <w:tr>
+        <w:trPr>
+          <w:trHeight w:val="1214"/>
+        </w:trPr>
+        <w:tc>
+          <w:tcPr>
+            <w:cnfStyle w:val="001000000000" w:firstRow="0" w:lastRow="0" w:firstColumn="1" w:lastColumn="0" w:oddVBand="0" w:evenVBand="0" w:oddHBand="0" w:evenHBand="0" w:firstRowFirstColumn="0" w:firstRowLastColumn="0" w:lastRowFirstColumn="0" w:lastRowLastColumn="0"/>
+            <w:tcW w:w="651" w:type="dxa"/>
+          </w:tcPr>
+          <w:p>
+            <w:pPr>
+              <w:jc w:val="center"/>
+              <w:rPr>
+                <w:rFonts w:ascii="Sakkal Majalla" w:hAnsi="Sakkal Majalla" w:cs="Sakkal Majalla"/>
+                <w:color w:val="0070C0"/>
+                <w:sz w:val="28"/>
+                <w:szCs w:val="28"/>
+              </w:rPr>
+            </w:pPr>
+            <w:r>
+              <w:rPr>
+                <w:rFonts w:ascii="Sakkal Majalla" w:hAnsi="Sakkal Majalla" w:cs="Sakkal Majalla"/>
+                <w:color w:val="0070C0"/>
+                <w:sz w:val="28"/>
+                <w:szCs w:val="28"/>
+              </w:rPr>
+              <w:t>42</w:t>
+            </w:r>
+          </w:p>
+        </w:tc>
+        <w:tc>
+          <w:tcPr>
+            <w:tcW w:w="6522" w:type="dxa"/>
+          </w:tcPr>
+          <w:p>
+            <w:pPr>
+              <w:tabs>
+                <w:tab w:val="left" w:pos="1662"/>
+              </w:tabs>
+              <w:cnfStyle w:val="000000000000" w:firstRow="0" w:lastRow="0" w:firstColumn="0" w:lastColumn="0" w:oddVBand="0" w:evenVBand="0" w:oddHBand="0" w:evenHBand="0" w:firstRowFirstColumn="0" w:firstRowLastColumn="0" w:lastRowFirstColumn="0" w:lastRowLastColumn="0"/>
+              <w:rPr>
+                <w:rFonts w:ascii="Sakkal Majalla" w:hAnsi="Sakkal Majalla" w:cs="Sakkal Majalla"/>
+                <w:sz w:val="28"/>
+                <w:szCs w:val="28"/>
+              </w:rPr>
+            </w:pPr>
+            <w:r>
+              <w:rPr>
+                <w:rFonts w:ascii="Sakkal Majalla" w:hAnsi="Sakkal Majalla" w:cs="Sakkal Majalla"/>
+                <w:sz w:val="28"/>
+                <w:szCs w:val="28"/>
+              </w:rPr>
+              <w:t>After we finish testing, we should begin with: E</w:t>
+            </w:r>
+            <w:r>
+              <w:rPr>
+                <w:rFonts w:ascii="Sakkal Majalla" w:hAnsi="Sakkal Majalla" w:cs="Sakkal Majalla"/>
+                <w:sz w:val="28"/>
+                <w:szCs w:val="28"/>
+              </w:rPr>
+              <w:t>xploratory</w:t>
+            </w:r>
+            <w:r>
+              <w:rPr>
+                <w:rFonts w:ascii="Sakkal Majalla" w:hAnsi="Sakkal Majalla" w:cs="Sakkal Majalla"/>
+                <w:sz w:val="28"/>
+                <w:szCs w:val="28"/>
+              </w:rPr>
+              <w:t xml:space="preserve"> T</w:t>
+            </w:r>
+            <w:r>
+              <w:rPr>
+                <w:rFonts w:ascii="Sakkal Majalla" w:hAnsi="Sakkal Majalla" w:cs="Sakkal Majalla"/>
+                <w:sz w:val="28"/>
+                <w:szCs w:val="28"/>
+              </w:rPr>
+              <w:t>esting</w:t>
+            </w:r>
+          </w:p>
+        </w:tc>
+        <w:tc>
+          <w:tcPr>
+            <w:tcW w:w="4728" w:type="dxa"/>
+          </w:tcPr>
+          <w:p>
+            <w:pPr>
+              <w:cnfStyle w:val="000000000000" w:firstRow="0" w:lastRow="0" w:firstColumn="0" w:lastColumn="0" w:oddVBand="0" w:evenVBand="0" w:oddHBand="0" w:evenHBand="0" w:firstRowFirstColumn="0" w:firstRowLastColumn="0" w:lastRowFirstColumn="0" w:lastRowLastColumn="0"/>
+              <w:rPr>
+                <w:rFonts w:ascii="Sakkal Majalla" w:hAnsi="Sakkal Majalla" w:cs="Sakkal Majalla"/>
+                <w:b/>
+                <w:bCs/>
+                <w:color w:val="3A7C22" w:themeColor="accent6" w:themeShade="BF"/>
+                <w:sz w:val="28"/>
+                <w:szCs w:val="28"/>
+              </w:rPr>
+            </w:pPr>
+            <w:r>
+              <w:rPr>
+                <w:rFonts w:ascii="Sakkal Majalla" w:hAnsi="Sakkal Majalla" w:cs="Sakkal Majalla"/>
+                <w:b/>
+                <w:bCs/>
+                <w:color w:val="3A7C22" w:themeColor="accent6" w:themeShade="BF"/>
+                <w:sz w:val="28"/>
+                <w:szCs w:val="28"/>
+              </w:rPr>
+              <w:t xml:space="preserve">Ex-01: </w:t>
+            </w:r>
+            <w:r>
+              <w:rPr>
+                <w:rFonts w:ascii="Sakkal Majalla" w:hAnsi="Sakkal Majalla" w:cs="Sakkal Majalla"/>
+                <w:color w:val="000000" w:themeColor="text1"/>
+                <w:sz w:val="28"/>
+                <w:szCs w:val="28"/>
+              </w:rPr>
+              <w:t>Use the chat bots, the chat agents, search web features of the chat bots, search engines, etc., to handle the future requirement, and observe the work of the tool.</w:t>
+            </w:r>
+          </w:p>
+        </w:tc>
+      </w:tr>
+      <w:tr>
+        <w:trPr>
+          <w:cnfStyle w:val="000000100000" w:firstRow="0" w:lastRow="0" w:firstColumn="0" w:lastColumn="0" w:oddVBand="0" w:evenVBand="0" w:oddHBand="1" w:evenHBand="0" w:firstRowFirstColumn="0" w:firstRowLastColumn="0" w:lastRowFirstColumn="0" w:lastRowLastColumn="0"/>
+          <w:trHeight w:val="1214"/>
+        </w:trPr>
+        <w:tc>
+          <w:tcPr>
+            <w:cnfStyle w:val="001000000000" w:firstRow="0" w:lastRow="0" w:firstColumn="1" w:lastColumn="0" w:oddVBand="0" w:evenVBand="0" w:oddHBand="0" w:evenHBand="0" w:firstRowFirstColumn="0" w:firstRowLastColumn="0" w:lastRowFirstColumn="0" w:lastRowLastColumn="0"/>
+            <w:tcW w:w="651" w:type="dxa"/>
+          </w:tcPr>
+          <w:p>
+            <w:pPr>
+              <w:jc w:val="center"/>
+              <w:rPr>
+                <w:rFonts w:ascii="Sakkal Majalla" w:hAnsi="Sakkal Majalla" w:cs="Sakkal Majalla"/>
+                <w:color w:val="0070C0"/>
+                <w:sz w:val="28"/>
+                <w:szCs w:val="28"/>
+              </w:rPr>
+            </w:pPr>
+            <w:r>
+              <w:rPr>
+                <w:rFonts w:ascii="Sakkal Majalla" w:hAnsi="Sakkal Majalla" w:cs="Sakkal Majalla"/>
+                <w:color w:val="0070C0"/>
+                <w:sz w:val="28"/>
+                <w:szCs w:val="28"/>
+              </w:rPr>
+              <w:t>43</w:t>
+            </w:r>
+          </w:p>
+        </w:tc>
+        <w:tc>
+          <w:tcPr>
+            <w:tcW w:w="6522" w:type="dxa"/>
+          </w:tcPr>
+          <w:p>
+            <w:pPr>
+              <w:tabs>
+                <w:tab w:val="left" w:pos="1662"/>
+              </w:tabs>
+              <w:cnfStyle w:val="000000100000" w:firstRow="0" w:lastRow="0" w:firstColumn="0" w:lastColumn="0" w:oddVBand="0" w:evenVBand="0" w:oddHBand="1" w:evenHBand="0" w:firstRowFirstColumn="0" w:firstRowLastColumn="0" w:lastRowFirstColumn="0" w:lastRowLastColumn="0"/>
+              <w:rPr>
+                <w:rFonts w:ascii="Sakkal Majalla" w:hAnsi="Sakkal Majalla" w:cs="Sakkal Majalla"/>
+                <w:sz w:val="28"/>
+                <w:szCs w:val="28"/>
+              </w:rPr>
+            </w:pPr>
+            <w:r>
+              <w:rPr>
+                <w:rFonts w:ascii="Sakkal Majalla" w:hAnsi="Sakkal Majalla" w:cs="Sakkal Majalla"/>
+                <w:sz w:val="28"/>
+                <w:szCs w:val="28"/>
+              </w:rPr>
+              <w:t xml:space="preserve">These tests </w:t>
+            </w:r>
+            <w:r>
+              <w:rPr>
+                <w:rFonts w:ascii="Sakkal Majalla" w:hAnsi="Sakkal Majalla" w:cs="Sakkal Majalla"/>
+                <w:sz w:val="28"/>
+                <w:szCs w:val="28"/>
+              </w:rPr>
+              <w:t xml:space="preserve">are </w:t>
+            </w:r>
+            <w:r>
+              <w:rPr>
+                <w:rFonts w:ascii="Sakkal Majalla" w:hAnsi="Sakkal Majalla" w:cs="Sakkal Majalla"/>
+                <w:sz w:val="28"/>
+                <w:szCs w:val="28"/>
+              </w:rPr>
+              <w:t xml:space="preserve">designed to test the non-functional aspects of a system </w:t>
+            </w:r>
+            <w:r>
+              <w:rPr>
+                <w:rFonts w:ascii="Sakkal Majalla" w:hAnsi="Sakkal Majalla" w:cs="Sakkal Majalla"/>
+                <w:sz w:val="28"/>
+                <w:szCs w:val="28"/>
+              </w:rPr>
+              <w:t xml:space="preserve">and </w:t>
+            </w:r>
+            <w:r>
+              <w:rPr>
+                <w:rFonts w:ascii="Sakkal Majalla" w:hAnsi="Sakkal Majalla" w:cs="Sakkal Majalla"/>
+                <w:sz w:val="28"/>
+                <w:szCs w:val="28"/>
+              </w:rPr>
+              <w:t>include:</w:t>
+            </w:r>
+          </w:p>
+          <w:p>
+            <w:pPr>
+              <w:numPr>
+                <w:ilvl w:val="0"/>
+                <w:numId w:val="8"/>
+              </w:numPr>
+              <w:tabs>
+                <w:tab w:val="left" w:pos="1662"/>
+              </w:tabs>
+              <w:cnfStyle w:val="000000100000" w:firstRow="0" w:lastRow="0" w:firstColumn="0" w:lastColumn="0" w:oddVBand="0" w:evenVBand="0" w:oddHBand="1" w:evenHBand="0" w:firstRowFirstColumn="0" w:firstRowLastColumn="0" w:lastRowFirstColumn="0" w:lastRowLastColumn="0"/>
+              <w:rPr>
+                <w:rFonts w:ascii="Sakkal Majalla" w:hAnsi="Sakkal Majalla" w:cs="Sakkal Majalla"/>
+                <w:sz w:val="28"/>
+                <w:szCs w:val="28"/>
+              </w:rPr>
+            </w:pPr>
+            <w:r>
+              <w:rPr>
+                <w:rFonts w:ascii="Sakkal Majalla" w:hAnsi="Sakkal Majalla" w:cs="Sakkal Majalla"/>
+                <w:sz w:val="28"/>
+                <w:szCs w:val="28"/>
+              </w:rPr>
+              <w:t>Security Testing.</w:t>
+            </w:r>
+          </w:p>
+          <w:p>
+            <w:pPr>
+              <w:numPr>
+                <w:ilvl w:val="0"/>
+                <w:numId w:val="8"/>
+              </w:numPr>
+              <w:tabs>
+                <w:tab w:val="left" w:pos="1662"/>
+              </w:tabs>
+              <w:cnfStyle w:val="000000100000" w:firstRow="0" w:lastRow="0" w:firstColumn="0" w:lastColumn="0" w:oddVBand="0" w:evenVBand="0" w:oddHBand="1" w:evenHBand="0" w:firstRowFirstColumn="0" w:firstRowLastColumn="0" w:lastRowFirstColumn="0" w:lastRowLastColumn="0"/>
+              <w:rPr>
+                <w:rFonts w:ascii="Sakkal Majalla" w:hAnsi="Sakkal Majalla" w:cs="Sakkal Majalla"/>
+                <w:sz w:val="28"/>
+                <w:szCs w:val="28"/>
+              </w:rPr>
+            </w:pPr>
+            <w:r>
+              <w:rPr>
+                <w:rFonts w:ascii="Sakkal Majalla" w:hAnsi="Sakkal Majalla" w:cs="Sakkal Majalla"/>
+                <w:sz w:val="28"/>
+                <w:szCs w:val="28"/>
+              </w:rPr>
+              <w:t>Performance Testing</w:t>
+            </w:r>
+            <w:r>
+              <w:rPr>
+                <w:rFonts w:ascii="Sakkal Majalla" w:hAnsi="Sakkal Majalla" w:cs="Sakkal Majalla"/>
+                <w:sz w:val="28"/>
+                <w:szCs w:val="28"/>
+              </w:rPr>
+              <w:t>.</w:t>
+            </w:r>
+          </w:p>
+          <w:p>
+            <w:pPr>
+              <w:numPr>
+                <w:ilvl w:val="0"/>
+                <w:numId w:val="8"/>
+              </w:numPr>
+              <w:tabs>
+                <w:tab w:val="left" w:pos="1662"/>
+              </w:tabs>
+              <w:cnfStyle w:val="000000100000" w:firstRow="0" w:lastRow="0" w:firstColumn="0" w:lastColumn="0" w:oddVBand="0" w:evenVBand="0" w:oddHBand="1" w:evenHBand="0" w:firstRowFirstColumn="0" w:firstRowLastColumn="0" w:lastRowFirstColumn="0" w:lastRowLastColumn="0"/>
+              <w:rPr>
+                <w:rFonts w:ascii="Sakkal Majalla" w:hAnsi="Sakkal Majalla" w:cs="Sakkal Majalla"/>
+                <w:sz w:val="28"/>
+                <w:szCs w:val="28"/>
+              </w:rPr>
+            </w:pPr>
+            <w:r>
+              <w:rPr>
+                <w:rFonts w:ascii="Sakkal Majalla" w:hAnsi="Sakkal Majalla" w:cs="Sakkal Majalla"/>
+                <w:sz w:val="28"/>
+                <w:szCs w:val="28"/>
+              </w:rPr>
+              <w:t>Compatibility Testing</w:t>
+            </w:r>
+            <w:r>
+              <w:rPr>
+                <w:rFonts w:ascii="Sakkal Majalla" w:hAnsi="Sakkal Majalla" w:cs="Sakkal Majalla"/>
+                <w:sz w:val="28"/>
+                <w:szCs w:val="28"/>
+              </w:rPr>
+              <w:t>.</w:t>
+            </w:r>
+          </w:p>
+          <w:p>
+            <w:pPr>
+              <w:numPr>
+                <w:ilvl w:val="0"/>
+                <w:numId w:val="8"/>
+              </w:numPr>
+              <w:tabs>
+                <w:tab w:val="left" w:pos="1662"/>
+              </w:tabs>
+              <w:cnfStyle w:val="000000100000" w:firstRow="0" w:lastRow="0" w:firstColumn="0" w:lastColumn="0" w:oddVBand="0" w:evenVBand="0" w:oddHBand="1" w:evenHBand="0" w:firstRowFirstColumn="0" w:firstRowLastColumn="0" w:lastRowFirstColumn="0" w:lastRowLastColumn="0"/>
+              <w:rPr>
+                <w:rFonts w:ascii="Sakkal Majalla" w:hAnsi="Sakkal Majalla" w:cs="Sakkal Majalla"/>
+                <w:sz w:val="28"/>
+                <w:szCs w:val="28"/>
+              </w:rPr>
+            </w:pPr>
+            <w:r>
+              <w:rPr>
+                <w:rFonts w:ascii="Sakkal Majalla" w:hAnsi="Sakkal Majalla" w:cs="Sakkal Majalla"/>
+                <w:sz w:val="28"/>
+                <w:szCs w:val="28"/>
+              </w:rPr>
+              <w:t>Compliance Testing</w:t>
+            </w:r>
+            <w:r>
+              <w:rPr>
+                <w:rFonts w:ascii="Sakkal Majalla" w:hAnsi="Sakkal Majalla" w:cs="Sakkal Majalla"/>
+                <w:sz w:val="28"/>
+                <w:szCs w:val="28"/>
+              </w:rPr>
+              <w:t>.</w:t>
+            </w:r>
+          </w:p>
+          <w:p>
+            <w:pPr>
+              <w:numPr>
+                <w:ilvl w:val="0"/>
+                <w:numId w:val="8"/>
+              </w:numPr>
+              <w:tabs>
+                <w:tab w:val="left" w:pos="1662"/>
+              </w:tabs>
+              <w:cnfStyle w:val="000000100000" w:firstRow="0" w:lastRow="0" w:firstColumn="0" w:lastColumn="0" w:oddVBand="0" w:evenVBand="0" w:oddHBand="1" w:evenHBand="0" w:firstRowFirstColumn="0" w:firstRowLastColumn="0" w:lastRowFirstColumn="0" w:lastRowLastColumn="0"/>
+              <w:rPr>
+                <w:rFonts w:ascii="Sakkal Majalla" w:hAnsi="Sakkal Majalla" w:cs="Sakkal Majalla"/>
+                <w:sz w:val="28"/>
+                <w:szCs w:val="28"/>
+              </w:rPr>
+            </w:pPr>
+            <w:r>
+              <w:rPr>
+                <w:rFonts w:ascii="Sakkal Majalla" w:hAnsi="Sakkal Majalla" w:cs="Sakkal Majalla"/>
+                <w:sz w:val="28"/>
+                <w:szCs w:val="28"/>
+              </w:rPr>
+              <w:t>Usability Testing</w:t>
+            </w:r>
+            <w:r>
+              <w:rPr>
+                <w:rFonts w:ascii="Sakkal Majalla" w:hAnsi="Sakkal Majalla" w:cs="Sakkal Majalla"/>
+                <w:sz w:val="28"/>
+                <w:szCs w:val="28"/>
+              </w:rPr>
+              <w:t>.</w:t>
+            </w:r>
+          </w:p>
+          <w:p>
+            <w:pPr>
+              <w:tabs>
+                <w:tab w:val="left" w:pos="1662"/>
+              </w:tabs>
+              <w:cnfStyle w:val="000000100000" w:firstRow="0" w:lastRow="0" w:firstColumn="0" w:lastColumn="0" w:oddVBand="0" w:evenVBand="0" w:oddHBand="1" w:evenHBand="0" w:firstRowFirstColumn="0" w:firstRowLastColumn="0" w:lastRowFirstColumn="0" w:lastRowLastColumn="0"/>
+              <w:rPr>
+                <w:rFonts w:ascii="Sakkal Majalla" w:hAnsi="Sakkal Majalla" w:cs="Sakkal Majalla"/>
+                <w:sz w:val="28"/>
+                <w:szCs w:val="28"/>
+              </w:rPr>
+            </w:pPr>
+          </w:p>
+        </w:tc>
+        <w:tc>
+          <w:tcPr>
+            <w:tcW w:w="4728" w:type="dxa"/>
+          </w:tcPr>
+          <w:p>
+            <w:pPr>
+              <w:cnfStyle w:val="000000100000" w:firstRow="0" w:lastRow="0" w:firstColumn="0" w:lastColumn="0" w:oddVBand="0" w:evenVBand="0" w:oddHBand="1" w:evenHBand="0" w:firstRowFirstColumn="0" w:firstRowLastColumn="0" w:lastRowFirstColumn="0" w:lastRowLastColumn="0"/>
+              <w:rPr>
+                <w:rFonts w:ascii="Sakkal Majalla" w:hAnsi="Sakkal Majalla" w:cs="Sakkal Majalla"/>
+                <w:b/>
+                <w:bCs/>
+                <w:color w:val="3A7C22" w:themeColor="accent6" w:themeShade="BF"/>
+                <w:sz w:val="28"/>
+                <w:szCs w:val="28"/>
+              </w:rPr>
+            </w:pPr>
+          </w:p>
+        </w:tc>
+      </w:tr>
+      <w:tr>
+        <w:trPr>
+          <w:trHeight w:val="1214"/>
+        </w:trPr>
+        <w:tc>
+          <w:tcPr>
+            <w:cnfStyle w:val="001000000000" w:firstRow="0" w:lastRow="0" w:firstColumn="1" w:lastColumn="0" w:oddVBand="0" w:evenVBand="0" w:oddHBand="0" w:evenHBand="0" w:firstRowFirstColumn="0" w:firstRowLastColumn="0" w:lastRowFirstColumn="0" w:lastRowLastColumn="0"/>
+            <w:tcW w:w="651" w:type="dxa"/>
+          </w:tcPr>
+          <w:p>
+            <w:pPr>
+              <w:jc w:val="center"/>
+              <w:rPr>
+                <w:rFonts w:ascii="Sakkal Majalla" w:hAnsi="Sakkal Majalla" w:cs="Sakkal Majalla"/>
+                <w:color w:val="0070C0"/>
+                <w:sz w:val="28"/>
+                <w:szCs w:val="28"/>
+              </w:rPr>
+            </w:pPr>
+            <w:r>
+              <w:rPr>
+                <w:rFonts w:ascii="Sakkal Majalla" w:hAnsi="Sakkal Majalla" w:cs="Sakkal Majalla"/>
+                <w:color w:val="0070C0"/>
+                <w:sz w:val="28"/>
+                <w:szCs w:val="28"/>
+              </w:rPr>
+              <w:lastRenderedPageBreak/>
+              <w:t>44</w:t>
+            </w:r>
+          </w:p>
+        </w:tc>
+        <w:tc>
+          <w:tcPr>
+            <w:tcW w:w="6522" w:type="dxa"/>
+          </w:tcPr>
+          <w:p>
+            <w:pPr>
+              <w:tabs>
+                <w:tab w:val="left" w:pos="1662"/>
+              </w:tabs>
+              <w:cnfStyle w:val="000000000000" w:firstRow="0" w:lastRow="0" w:firstColumn="0" w:lastColumn="0" w:oddVBand="0" w:evenVBand="0" w:oddHBand="0" w:evenHBand="0" w:firstRowFirstColumn="0" w:firstRowLastColumn="0" w:lastRowFirstColumn="0" w:lastRowLastColumn="0"/>
+              <w:rPr>
+                <w:rFonts w:ascii="Sakkal Majalla" w:hAnsi="Sakkal Majalla" w:cs="Sakkal Majalla"/>
+                <w:sz w:val="28"/>
+                <w:szCs w:val="28"/>
+              </w:rPr>
+            </w:pPr>
+            <w:r>
+              <w:rPr>
+                <w:rFonts w:ascii="Sakkal Majalla" w:hAnsi="Sakkal Majalla" w:cs="Sakkal Majalla"/>
+                <w:sz w:val="28"/>
+                <w:szCs w:val="28"/>
+              </w:rPr>
+              <w:t>Types of functional tests primarily include:</w:t>
+            </w:r>
+          </w:p>
+          <w:p>
+            <w:pPr>
+              <w:numPr>
+                <w:ilvl w:val="0"/>
+                <w:numId w:val="9"/>
+              </w:numPr>
+              <w:tabs>
+                <w:tab w:val="left" w:pos="1662"/>
+              </w:tabs>
+              <w:cnfStyle w:val="000000000000" w:firstRow="0" w:lastRow="0" w:firstColumn="0" w:lastColumn="0" w:oddVBand="0" w:evenVBand="0" w:oddHBand="0" w:evenHBand="0" w:firstRowFirstColumn="0" w:firstRowLastColumn="0" w:lastRowFirstColumn="0" w:lastRowLastColumn="0"/>
+              <w:rPr>
+                <w:rFonts w:ascii="Sakkal Majalla" w:hAnsi="Sakkal Majalla" w:cs="Sakkal Majalla"/>
+                <w:sz w:val="28"/>
+                <w:szCs w:val="28"/>
+              </w:rPr>
+            </w:pPr>
+            <w:r>
+              <w:rPr>
+                <w:rFonts w:ascii="Sakkal Majalla" w:hAnsi="Sakkal Majalla" w:cs="Sakkal Majalla"/>
+                <w:sz w:val="28"/>
+                <w:szCs w:val="28"/>
+              </w:rPr>
+              <w:t>Acceptance Testing</w:t>
+            </w:r>
+            <w:r>
+              <w:rPr>
+                <w:rFonts w:ascii="Sakkal Majalla" w:hAnsi="Sakkal Majalla" w:cs="Sakkal Majalla"/>
+                <w:sz w:val="28"/>
+                <w:szCs w:val="28"/>
+              </w:rPr>
+              <w:t>.</w:t>
+            </w:r>
+          </w:p>
+          <w:p>
+            <w:pPr>
+              <w:numPr>
+                <w:ilvl w:val="0"/>
+                <w:numId w:val="9"/>
+              </w:numPr>
+              <w:tabs>
+                <w:tab w:val="left" w:pos="1662"/>
+              </w:tabs>
+              <w:cnfStyle w:val="000000000000" w:firstRow="0" w:lastRow="0" w:firstColumn="0" w:lastColumn="0" w:oddVBand="0" w:evenVBand="0" w:oddHBand="0" w:evenHBand="0" w:firstRowFirstColumn="0" w:firstRowLastColumn="0" w:lastRowFirstColumn="0" w:lastRowLastColumn="0"/>
+              <w:rPr>
+                <w:rFonts w:ascii="Sakkal Majalla" w:hAnsi="Sakkal Majalla" w:cs="Sakkal Majalla"/>
+                <w:sz w:val="28"/>
+                <w:szCs w:val="28"/>
+              </w:rPr>
+            </w:pPr>
+            <w:r>
+              <w:rPr>
+                <w:rFonts w:ascii="Sakkal Majalla" w:hAnsi="Sakkal Majalla" w:cs="Sakkal Majalla"/>
+                <w:sz w:val="28"/>
+                <w:szCs w:val="28"/>
+              </w:rPr>
+              <w:t>System Testing</w:t>
+            </w:r>
+            <w:r>
+              <w:rPr>
+                <w:rFonts w:ascii="Sakkal Majalla" w:hAnsi="Sakkal Majalla" w:cs="Sakkal Majalla"/>
+                <w:sz w:val="28"/>
+                <w:szCs w:val="28"/>
+              </w:rPr>
+              <w:t>.</w:t>
+            </w:r>
+          </w:p>
+          <w:p>
+            <w:pPr>
+              <w:numPr>
+                <w:ilvl w:val="0"/>
+                <w:numId w:val="10"/>
+              </w:numPr>
+              <w:tabs>
+                <w:tab w:val="left" w:pos="1662"/>
+              </w:tabs>
+              <w:cnfStyle w:val="000000000000" w:firstRow="0" w:lastRow="0" w:firstColumn="0" w:lastColumn="0" w:oddVBand="0" w:evenVBand="0" w:oddHBand="0" w:evenHBand="0" w:firstRowFirstColumn="0" w:firstRowLastColumn="0" w:lastRowFirstColumn="0" w:lastRowLastColumn="0"/>
+              <w:rPr>
+                <w:rFonts w:ascii="Sakkal Majalla" w:hAnsi="Sakkal Majalla" w:cs="Sakkal Majalla"/>
+                <w:sz w:val="28"/>
+                <w:szCs w:val="28"/>
+              </w:rPr>
+            </w:pPr>
+            <w:r>
+              <w:rPr>
+                <w:rFonts w:ascii="Sakkal Majalla" w:hAnsi="Sakkal Majalla" w:cs="Sakkal Majalla"/>
+                <w:sz w:val="28"/>
+                <w:szCs w:val="28"/>
+              </w:rPr>
+              <w:t>Integration Testing</w:t>
+            </w:r>
+            <w:r>
+              <w:rPr>
+                <w:rFonts w:ascii="Sakkal Majalla" w:hAnsi="Sakkal Majalla" w:cs="Sakkal Majalla"/>
+                <w:sz w:val="28"/>
+                <w:szCs w:val="28"/>
+              </w:rPr>
+              <w:t>.</w:t>
+            </w:r>
+          </w:p>
+          <w:p>
+            <w:pPr>
+              <w:numPr>
+                <w:ilvl w:val="0"/>
+                <w:numId w:val="10"/>
+              </w:numPr>
+              <w:tabs>
+                <w:tab w:val="left" w:pos="1662"/>
+              </w:tabs>
+              <w:cnfStyle w:val="000000000000" w:firstRow="0" w:lastRow="0" w:firstColumn="0" w:lastColumn="0" w:oddVBand="0" w:evenVBand="0" w:oddHBand="0" w:evenHBand="0" w:firstRowFirstColumn="0" w:firstRowLastColumn="0" w:lastRowFirstColumn="0" w:lastRowLastColumn="0"/>
+              <w:rPr>
+                <w:rFonts w:ascii="Sakkal Majalla" w:hAnsi="Sakkal Majalla" w:cs="Sakkal Majalla"/>
+                <w:sz w:val="28"/>
+                <w:szCs w:val="28"/>
+              </w:rPr>
+            </w:pPr>
+            <w:r>
+              <w:rPr>
+                <w:rFonts w:ascii="Sakkal Majalla" w:hAnsi="Sakkal Majalla" w:cs="Sakkal Majalla"/>
+                <w:sz w:val="28"/>
+                <w:szCs w:val="28"/>
+              </w:rPr>
+              <w:t>Interface Testing</w:t>
+            </w:r>
+            <w:r>
+              <w:rPr>
+                <w:rFonts w:ascii="Sakkal Majalla" w:hAnsi="Sakkal Majalla" w:cs="Sakkal Majalla"/>
+                <w:sz w:val="28"/>
+                <w:szCs w:val="28"/>
+              </w:rPr>
+              <w:t>.</w:t>
+            </w:r>
+          </w:p>
+          <w:p>
+            <w:pPr>
+              <w:numPr>
+                <w:ilvl w:val="0"/>
+                <w:numId w:val="10"/>
+              </w:numPr>
+              <w:tabs>
+                <w:tab w:val="left" w:pos="1662"/>
+              </w:tabs>
+              <w:cnfStyle w:val="000000000000" w:firstRow="0" w:lastRow="0" w:firstColumn="0" w:lastColumn="0" w:oddVBand="0" w:evenVBand="0" w:oddHBand="0" w:evenHBand="0" w:firstRowFirstColumn="0" w:firstRowLastColumn="0" w:lastRowFirstColumn="0" w:lastRowLastColumn="0"/>
+              <w:rPr>
+                <w:rFonts w:ascii="Sakkal Majalla" w:hAnsi="Sakkal Majalla" w:cs="Sakkal Majalla"/>
+                <w:sz w:val="28"/>
+                <w:szCs w:val="28"/>
+              </w:rPr>
+            </w:pPr>
+            <w:r>
+              <w:rPr>
+                <w:rFonts w:ascii="Sakkal Majalla" w:hAnsi="Sakkal Majalla" w:cs="Sakkal Majalla"/>
+                <w:sz w:val="28"/>
+                <w:szCs w:val="28"/>
+              </w:rPr>
+              <w:t>Smoke Testing</w:t>
+            </w:r>
+            <w:r>
+              <w:rPr>
+                <w:rFonts w:ascii="Sakkal Majalla" w:hAnsi="Sakkal Majalla" w:cs="Sakkal Majalla"/>
+                <w:sz w:val="28"/>
+                <w:szCs w:val="28"/>
+              </w:rPr>
+              <w:t>.</w:t>
+            </w:r>
+          </w:p>
+          <w:p>
+            <w:pPr>
+              <w:numPr>
+                <w:ilvl w:val="0"/>
+                <w:numId w:val="10"/>
+              </w:numPr>
+              <w:tabs>
+                <w:tab w:val="left" w:pos="1662"/>
+              </w:tabs>
+              <w:cnfStyle w:val="000000000000" w:firstRow="0" w:lastRow="0" w:firstColumn="0" w:lastColumn="0" w:oddVBand="0" w:evenVBand="0" w:oddHBand="0" w:evenHBand="0" w:firstRowFirstColumn="0" w:firstRowLastColumn="0" w:lastRowFirstColumn="0" w:lastRowLastColumn="0"/>
+              <w:rPr>
+                <w:rFonts w:ascii="Sakkal Majalla" w:hAnsi="Sakkal Majalla" w:cs="Sakkal Majalla"/>
+                <w:sz w:val="28"/>
+                <w:szCs w:val="28"/>
+              </w:rPr>
+            </w:pPr>
+            <w:r>
+              <w:rPr>
+                <w:rFonts w:ascii="Sakkal Majalla" w:hAnsi="Sakkal Majalla" w:cs="Sakkal Majalla"/>
+                <w:sz w:val="28"/>
+                <w:szCs w:val="28"/>
+              </w:rPr>
+              <w:t>Unit Testing</w:t>
+            </w:r>
+            <w:r>
+              <w:rPr>
+                <w:rFonts w:ascii="Sakkal Majalla" w:hAnsi="Sakkal Majalla" w:cs="Sakkal Majalla"/>
+                <w:sz w:val="28"/>
+                <w:szCs w:val="28"/>
+              </w:rPr>
+              <w:t>.</w:t>
+            </w:r>
+          </w:p>
+          <w:p>
+            <w:pPr>
+              <w:numPr>
+                <w:ilvl w:val="0"/>
+                <w:numId w:val="10"/>
+              </w:numPr>
+              <w:tabs>
+                <w:tab w:val="left" w:pos="1662"/>
+              </w:tabs>
+              <w:cnfStyle w:val="000000000000" w:firstRow="0" w:lastRow="0" w:firstColumn="0" w:lastColumn="0" w:oddVBand="0" w:evenVBand="0" w:oddHBand="0" w:evenHBand="0" w:firstRowFirstColumn="0" w:firstRowLastColumn="0" w:lastRowFirstColumn="0" w:lastRowLastColumn="0"/>
+              <w:rPr>
+                <w:rFonts w:ascii="Sakkal Majalla" w:hAnsi="Sakkal Majalla" w:cs="Sakkal Majalla"/>
+                <w:sz w:val="28"/>
+                <w:szCs w:val="28"/>
+              </w:rPr>
+            </w:pPr>
+            <w:r>
+              <w:rPr>
+                <w:rFonts w:ascii="Sakkal Majalla" w:hAnsi="Sakkal Majalla" w:cs="Sakkal Majalla"/>
+                <w:sz w:val="28"/>
+                <w:szCs w:val="28"/>
+              </w:rPr>
+              <w:t>And others.</w:t>
+            </w:r>
+          </w:p>
+        </w:tc>
+        <w:tc>
+          <w:tcPr>
+            <w:tcW w:w="4728" w:type="dxa"/>
+          </w:tcPr>
+          <w:p>
+            <w:pPr>
+              <w:cnfStyle w:val="000000000000" w:firstRow="0" w:lastRow="0" w:firstColumn="0" w:lastColumn="0" w:oddVBand="0" w:evenVBand="0" w:oddHBand="0" w:evenHBand="0" w:firstRowFirstColumn="0" w:firstRowLastColumn="0" w:lastRowFirstColumn="0" w:lastRowLastColumn="0"/>
+              <w:rPr>
+                <w:rFonts w:ascii="Sakkal Majalla" w:hAnsi="Sakkal Majalla" w:cs="Sakkal Majalla"/>
+                <w:b/>
+                <w:bCs/>
+                <w:color w:val="3A7C22" w:themeColor="accent6" w:themeShade="BF"/>
+                <w:sz w:val="28"/>
+                <w:szCs w:val="28"/>
+              </w:rPr>
+            </w:pPr>
+          </w:p>
+        </w:tc>
+      </w:tr>
+      <w:tr>
+        <w:trPr>
+          <w:cnfStyle w:val="000000100000" w:firstRow="0" w:lastRow="0" w:firstColumn="0" w:lastColumn="0" w:oddVBand="0" w:evenVBand="0" w:oddHBand="1" w:evenHBand="0" w:firstRowFirstColumn="0" w:firstRowLastColumn="0" w:lastRowFirstColumn="0" w:lastRowLastColumn="0"/>
+          <w:trHeight w:val="1214"/>
+        </w:trPr>
+        <w:tc>
+          <w:tcPr>
+            <w:cnfStyle w:val="001000000000" w:firstRow="0" w:lastRow="0" w:firstColumn="1" w:lastColumn="0" w:oddVBand="0" w:evenVBand="0" w:oddHBand="0" w:evenHBand="0" w:firstRowFirstColumn="0" w:firstRowLastColumn="0" w:lastRowFirstColumn="0" w:lastRowLastColumn="0"/>
+            <w:tcW w:w="651" w:type="dxa"/>
+          </w:tcPr>
+          <w:p>
+            <w:pPr>
+              <w:jc w:val="center"/>
+              <w:rPr>
+                <w:rFonts w:ascii="Sakkal Majalla" w:hAnsi="Sakkal Majalla" w:cs="Sakkal Majalla"/>
+                <w:color w:val="0070C0"/>
+                <w:sz w:val="28"/>
+                <w:szCs w:val="28"/>
+              </w:rPr>
+            </w:pPr>
+            <w:r>
+              <w:rPr>
+                <w:rFonts w:ascii="Sakkal Majalla" w:hAnsi="Sakkal Majalla" w:cs="Sakkal Majalla"/>
+                <w:color w:val="0070C0"/>
+                <w:sz w:val="28"/>
+                <w:szCs w:val="28"/>
+              </w:rPr>
+              <w:t>45</w:t>
+            </w:r>
+          </w:p>
+        </w:tc>
+        <w:tc>
+          <w:tcPr>
+            <w:tcW w:w="6522" w:type="dxa"/>
+          </w:tcPr>
+          <w:p>
+            <w:pPr>
+              <w:tabs>
+                <w:tab w:val="left" w:pos="1662"/>
+              </w:tabs>
+              <w:cnfStyle w:val="000000100000" w:firstRow="0" w:lastRow="0" w:firstColumn="0" w:lastColumn="0" w:oddVBand="0" w:evenVBand="0" w:oddHBand="1" w:evenHBand="0" w:firstRowFirstColumn="0" w:firstRowLastColumn="0" w:lastRowFirstColumn="0" w:lastRowLastColumn="0"/>
+              <w:rPr>
+                <w:rFonts w:ascii="Sakkal Majalla" w:hAnsi="Sakkal Majalla" w:cs="Sakkal Majalla"/>
+                <w:sz w:val="28"/>
+                <w:szCs w:val="28"/>
+              </w:rPr>
+            </w:pPr>
+            <w:r>
+              <w:rPr>
+                <w:rFonts w:ascii="Sakkal Majalla" w:hAnsi="Sakkal Majalla" w:cs="Sakkal Majalla"/>
+                <w:sz w:val="28"/>
+                <w:szCs w:val="28"/>
+              </w:rPr>
+              <w:t>When testing e-commerce documents check the validation of fields for each type.</w:t>
+            </w:r>
+          </w:p>
+        </w:tc>
+        <w:tc>
+          <w:tcPr>
+            <w:tcW w:w="4728" w:type="dxa"/>
+          </w:tcPr>
+          <w:p>
+            <w:pPr>
+              <w:cnfStyle w:val="000000100000" w:firstRow="0" w:lastRow="0" w:firstColumn="0" w:lastColumn="0" w:oddVBand="0" w:evenVBand="0" w:oddHBand="1" w:evenHBand="0" w:firstRowFirstColumn="0" w:firstRowLastColumn="0" w:lastRowFirstColumn="0" w:lastRowLastColumn="0"/>
+              <w:rPr>
+                <w:rFonts w:ascii="Sakkal Majalla" w:hAnsi="Sakkal Majalla" w:cs="Sakkal Majalla"/>
+                <w:color w:val="auto"/>
+                <w:sz w:val="28"/>
+                <w:szCs w:val="28"/>
+              </w:rPr>
+            </w:pPr>
+            <w:r>
+              <w:rPr>
+                <w:rFonts w:ascii="Sakkal Majalla" w:hAnsi="Sakkal Majalla" w:cs="Sakkal Majalla"/>
+                <w:b/>
+                <w:bCs/>
+                <w:color w:val="3A7C22" w:themeColor="accent6" w:themeShade="BF"/>
+                <w:sz w:val="28"/>
+                <w:szCs w:val="28"/>
+              </w:rPr>
+              <w:t xml:space="preserve">Ex-01: </w:t>
+            </w:r>
+            <w:r>
+              <w:rPr>
+                <w:rFonts w:ascii="Sakkal Majalla" w:hAnsi="Sakkal Majalla" w:cs="Sakkal Majalla"/>
+                <w:color w:val="auto"/>
+                <w:sz w:val="28"/>
+                <w:szCs w:val="28"/>
+              </w:rPr>
+              <w:t>The quotation should have no validation at all.</w:t>
+            </w:r>
+          </w:p>
+          <w:p>
+            <w:pPr>
+              <w:cnfStyle w:val="000000100000" w:firstRow="0" w:lastRow="0" w:firstColumn="0" w:lastColumn="0" w:oddVBand="0" w:evenVBand="0" w:oddHBand="1" w:evenHBand="0" w:firstRowFirstColumn="0" w:firstRowLastColumn="0" w:lastRowFirstColumn="0" w:lastRowLastColumn="0"/>
+              <w:rPr>
+                <w:rFonts w:ascii="Sakkal Majalla" w:hAnsi="Sakkal Majalla" w:cs="Sakkal Majalla"/>
+                <w:color w:val="auto"/>
+                <w:sz w:val="28"/>
+                <w:szCs w:val="28"/>
+              </w:rPr>
+            </w:pPr>
+            <w:r>
+              <w:rPr>
+                <w:rFonts w:ascii="Sakkal Majalla" w:hAnsi="Sakkal Majalla" w:cs="Sakkal Majalla"/>
+                <w:b/>
+                <w:bCs/>
+                <w:color w:val="3A7C22" w:themeColor="accent6" w:themeShade="BF"/>
+                <w:sz w:val="28"/>
+                <w:szCs w:val="28"/>
+              </w:rPr>
+              <w:t>Ex-02</w:t>
+            </w:r>
+            <w:r>
+              <w:rPr>
+                <w:rFonts w:ascii="Sakkal Majalla" w:hAnsi="Sakkal Majalla" w:cs="Sakkal Majalla"/>
+                <w:color w:val="auto"/>
+                <w:sz w:val="28"/>
+                <w:szCs w:val="28"/>
+              </w:rPr>
+              <w:t>: The order should have configurations for signature, and all the fields are required.</w:t>
+            </w:r>
+          </w:p>
+          <w:p>
+            <w:pPr>
+              <w:cnfStyle w:val="000000100000" w:firstRow="0" w:lastRow="0" w:firstColumn="0" w:lastColumn="0" w:oddVBand="0" w:evenVBand="0" w:oddHBand="1" w:evenHBand="0" w:firstRowFirstColumn="0" w:firstRowLastColumn="0" w:lastRowFirstColumn="0" w:lastRowLastColumn="0"/>
+              <w:rPr>
+                <w:rFonts w:ascii="Sakkal Majalla" w:hAnsi="Sakkal Majalla" w:cs="Sakkal Majalla"/>
+                <w:color w:val="auto"/>
+                <w:sz w:val="28"/>
+                <w:szCs w:val="28"/>
+              </w:rPr>
+            </w:pPr>
+            <w:r>
+              <w:rPr>
+                <w:rFonts w:ascii="Sakkal Majalla" w:hAnsi="Sakkal Majalla" w:cs="Sakkal Majalla"/>
+                <w:b/>
+                <w:bCs/>
+                <w:color w:val="3A7C22" w:themeColor="accent6" w:themeShade="BF"/>
+                <w:sz w:val="28"/>
+                <w:szCs w:val="28"/>
+              </w:rPr>
+              <w:t>Ex-03</w:t>
+            </w:r>
+            <w:r>
+              <w:rPr>
+                <w:rFonts w:ascii="Sakkal Majalla" w:hAnsi="Sakkal Majalla" w:cs="Sakkal Majalla"/>
+                <w:color w:val="auto"/>
+                <w:sz w:val="28"/>
+                <w:szCs w:val="28"/>
+              </w:rPr>
+              <w:t>: The order document should be trucked if we have an active payment on it.</w:t>
+            </w:r>
+          </w:p>
+          <w:p>
+            <w:pPr>
+              <w:cnfStyle w:val="000000100000" w:firstRow="0" w:lastRow="0" w:firstColumn="0" w:lastColumn="0" w:oddVBand="0" w:evenVBand="0" w:oddHBand="1" w:evenHBand="0" w:firstRowFirstColumn="0" w:firstRowLastColumn="0" w:lastRowFirstColumn="0" w:lastRowLastColumn="0"/>
+              <w:rPr>
+                <w:rFonts w:ascii="Sakkal Majalla" w:hAnsi="Sakkal Majalla" w:cs="Sakkal Majalla"/>
+                <w:color w:val="auto"/>
+                <w:sz w:val="28"/>
+                <w:szCs w:val="28"/>
+              </w:rPr>
+            </w:pPr>
+            <w:r>
+              <w:rPr>
+                <w:rFonts w:ascii="Sakkal Majalla" w:hAnsi="Sakkal Majalla" w:cs="Sakkal Majalla"/>
+                <w:b/>
+                <w:bCs/>
+                <w:color w:val="3A7C22" w:themeColor="accent6" w:themeShade="BF"/>
+                <w:sz w:val="28"/>
+                <w:szCs w:val="28"/>
+              </w:rPr>
+              <w:t>Ex-04</w:t>
+            </w:r>
+            <w:r>
+              <w:rPr>
+                <w:rFonts w:ascii="Sakkal Majalla" w:hAnsi="Sakkal Majalla" w:cs="Sakkal Majalla"/>
+                <w:color w:val="auto"/>
+                <w:sz w:val="28"/>
+                <w:szCs w:val="28"/>
+              </w:rPr>
+              <w:t>: Check the warehouse distribution for the delivery document.</w:t>
+            </w:r>
+          </w:p>
+          <w:p>
+            <w:pPr>
+              <w:cnfStyle w:val="000000100000" w:firstRow="0" w:lastRow="0" w:firstColumn="0" w:lastColumn="0" w:oddVBand="0" w:evenVBand="0" w:oddHBand="1" w:evenHBand="0" w:firstRowFirstColumn="0" w:firstRowLastColumn="0" w:lastRowFirstColumn="0" w:lastRowLastColumn="0"/>
+              <w:rPr>
+                <w:rFonts w:ascii="Sakkal Majalla" w:hAnsi="Sakkal Majalla" w:cs="Sakkal Majalla"/>
+                <w:color w:val="auto"/>
+                <w:sz w:val="28"/>
+                <w:szCs w:val="28"/>
+              </w:rPr>
+            </w:pPr>
+            <w:r>
+              <w:rPr>
+                <w:rFonts w:ascii="Sakkal Majalla" w:hAnsi="Sakkal Majalla" w:cs="Sakkal Majalla"/>
+                <w:b/>
+                <w:bCs/>
+                <w:color w:val="3A7C22" w:themeColor="accent6" w:themeShade="BF"/>
+                <w:sz w:val="28"/>
+                <w:szCs w:val="28"/>
+              </w:rPr>
+              <w:t>Ex-05</w:t>
+            </w:r>
+            <w:r>
+              <w:rPr>
+                <w:rFonts w:ascii="Sakkal Majalla" w:hAnsi="Sakkal Majalla" w:cs="Sakkal Majalla"/>
+                <w:color w:val="auto"/>
+                <w:sz w:val="28"/>
+                <w:szCs w:val="28"/>
+              </w:rPr>
+              <w:t>: Check the Goods Issue for the approved return request.</w:t>
+            </w:r>
+          </w:p>
+          <w:p>
+            <w:pPr>
+              <w:cnfStyle w:val="000000100000" w:firstRow="0" w:lastRow="0" w:firstColumn="0" w:lastColumn="0" w:oddVBand="0" w:evenVBand="0" w:oddHBand="1" w:evenHBand="0" w:firstRowFirstColumn="0" w:firstRowLastColumn="0" w:lastRowFirstColumn="0" w:lastRowLastColumn="0"/>
+              <w:rPr>
+                <w:rFonts w:ascii="Sakkal Majalla" w:hAnsi="Sakkal Majalla" w:cs="Sakkal Majalla"/>
+                <w:color w:val="auto"/>
+                <w:sz w:val="28"/>
+                <w:szCs w:val="28"/>
+              </w:rPr>
+            </w:pPr>
+            <w:r>
+              <w:rPr>
+                <w:rFonts w:ascii="Sakkal Majalla" w:hAnsi="Sakkal Majalla" w:cs="Sakkal Majalla"/>
+                <w:b/>
+                <w:bCs/>
+                <w:color w:val="3A7C22" w:themeColor="accent6" w:themeShade="BF"/>
+                <w:sz w:val="28"/>
+                <w:szCs w:val="28"/>
+              </w:rPr>
+              <w:t>Ex-06</w:t>
+            </w:r>
+            <w:r>
+              <w:rPr>
+                <w:rFonts w:ascii="Sakkal Majalla" w:hAnsi="Sakkal Majalla" w:cs="Sakkal Majalla"/>
+                <w:color w:val="auto"/>
+                <w:sz w:val="28"/>
+                <w:szCs w:val="28"/>
+              </w:rPr>
+              <w:t>: Check the credit limit for the selected customer for credit note.</w:t>
             </w:r>
           </w:p>
         </w:tc>
@@ -8742,6 +11157,333 @@
 <file path=word/numbering.xml><?xml version="1.0" encoding="utf-8"?>
 <w:numbering xmlns:wpc="http://schemas.microsoft.com/office/word/2010/wordprocessingCanvas" xmlns:cx="http://schemas.microsoft.com/office/drawing/2014/chartex" xmlns:cx1="http://schemas.microsoft.com/office/drawing/2015/9/8/chartex" xmlns:cx2="http://schemas.microsoft.com/office/drawing/2015/10/21/chartex" xmlns:cx3="http://schemas.microsoft.com/office/drawing/2016/5/9/chartex" xmlns:cx4="http://schemas.microsoft.com/office/drawing/2016/5/10/chartex" xmlns:cx5="http://schemas.microsoft.com/office/drawing/2016/5/11/chartex" xmlns:cx6="http://schemas.microsoft.com/office/drawing/2016/5/12/chartex" xmlns:cx7="http://schemas.microsoft.com/office/drawing/2016/5/13/chartex" xmlns:cx8="http://schemas.microsoft.com/office/drawing/2016/5/14/chartex" xmlns:mc="http://schemas.openxmlformats.org/markup-compatibility/2006" xmlns:aink="http://schemas.microsoft.com/office/drawing/2016/ink" xmlns:am3d="http://schemas.microsoft.com/office/drawing/2017/model3d" xmlns:o="urn:schemas-microsoft-com:office:office" xmlns:oel="http://schemas.microsoft.com/office/2019/extlst" xmlns:r="http://schemas.openxmlformats.org/officeDocument/2006/relationships" xmlns:m="http://schemas.openxmlformats.org/officeDocument/2006/math" xmlns:v="urn:schemas-microsoft-com:vml" xmlns:wp14="http://schemas.microsoft.com/office/word/2010/wordprocessingDrawing" xmlns:wp="http://schemas.openxmlformats.org/drawingml/2006/wordprocessingDrawing" xmlns:w10="urn:schemas-microsoft-com:office:word" xmlns:w="http://schemas.openxmlformats.org/wordprocessingml/2006/main" xmlns:w14="http://schemas.microsoft.com/office/word/2010/wordml" xmlns:w15="http://schemas.microsoft.com/office/word/2012/wordml" xmlns:w16cex="http://schemas.microsoft.com/office/word/2018/wordml/cex" xmlns:w16cid="http://schemas.microsoft.com/office/word/2016/wordml/cid" xmlns:w16="http://schemas.microsoft.com/office/word/2018/wordml" xmlns:w16du="http://schemas.microsoft.com/office/word/2023/wordml/word16du" xmlns:w16sdtdh="http://schemas.microsoft.com/office/word/2020/wordml/sdtdatahash" xmlns:w16sdtfl="http://schemas.microsoft.com/office/word/2024/wordml/sdtformatlock" xmlns:w16se="http://schemas.microsoft.com/office/word/2015/wordml/symex" xmlns:wpg="http://schemas.microsoft.com/office/word/2010/wordprocessingGroup" xmlns:wpi="http://schemas.microsoft.com/office/word/2010/wordprocessingInk" xmlns:wne="http://schemas.microsoft.com/office/word/2006/wordml" xmlns:wps="http://schemas.microsoft.com/office/word/2010/wordprocessingShape" mc:Ignorable="w14 w15 w16se w16cid w16 w16cex w16sdtdh w16sdtfl w16du wp14">
   <w:abstractNum w:abstractNumId="0" w15:restartNumberingAfterBreak="0">
+    <w:nsid w:val="013049BA"/>
+    <w:multiLevelType w:val="multilevel"/>
+    <w:tmpl w:val="4DA89290"/>
+    <w:lvl w:ilvl="0">
+      <w:start w:val="1"/>
+      <w:numFmt w:val="bullet"/>
+      <w:lvlText w:val=""/>
+      <w:lvlJc w:val="left"/>
+      <w:pPr>
+        <w:tabs>
+          <w:tab w:val="num" w:pos="720"/>
+        </w:tabs>
+        <w:ind w:left="720" w:hanging="360"/>
+      </w:pPr>
+      <w:rPr>
+        <w:rFonts w:ascii="Symbol" w:hAnsi="Symbol" w:hint="default"/>
+        <w:sz w:val="20"/>
+      </w:rPr>
+    </w:lvl>
+    <w:lvl w:ilvl="1" w:tentative="1">
+      <w:start w:val="1"/>
+      <w:numFmt w:val="bullet"/>
+      <w:lvlText w:val="o"/>
+      <w:lvlJc w:val="left"/>
+      <w:pPr>
+        <w:tabs>
+          <w:tab w:val="num" w:pos="1440"/>
+        </w:tabs>
+        <w:ind w:left="1440" w:hanging="360"/>
+      </w:pPr>
+      <w:rPr>
+        <w:rFonts w:ascii="Courier New" w:hAnsi="Courier New" w:hint="default"/>
+        <w:sz w:val="20"/>
+      </w:rPr>
+    </w:lvl>
+    <w:lvl w:ilvl="2" w:tentative="1">
+      <w:start w:val="1"/>
+      <w:numFmt w:val="bullet"/>
+      <w:lvlText w:val=""/>
+      <w:lvlJc w:val="left"/>
+      <w:pPr>
+        <w:tabs>
+          <w:tab w:val="num" w:pos="2160"/>
+        </w:tabs>
+        <w:ind w:left="2160" w:hanging="360"/>
+      </w:pPr>
+      <w:rPr>
+        <w:rFonts w:ascii="Wingdings" w:hAnsi="Wingdings" w:hint="default"/>
+        <w:sz w:val="20"/>
+      </w:rPr>
+    </w:lvl>
+    <w:lvl w:ilvl="3" w:tentative="1">
+      <w:start w:val="1"/>
+      <w:numFmt w:val="bullet"/>
+      <w:lvlText w:val=""/>
+      <w:lvlJc w:val="left"/>
+      <w:pPr>
+        <w:tabs>
+          <w:tab w:val="num" w:pos="2880"/>
+        </w:tabs>
+        <w:ind w:left="2880" w:hanging="360"/>
+      </w:pPr>
+      <w:rPr>
+        <w:rFonts w:ascii="Wingdings" w:hAnsi="Wingdings" w:hint="default"/>
+        <w:sz w:val="20"/>
+      </w:rPr>
+    </w:lvl>
+    <w:lvl w:ilvl="4" w:tentative="1">
+      <w:start w:val="1"/>
+      <w:numFmt w:val="bullet"/>
+      <w:lvlText w:val=""/>
+      <w:lvlJc w:val="left"/>
+      <w:pPr>
+        <w:tabs>
+          <w:tab w:val="num" w:pos="3600"/>
+        </w:tabs>
+        <w:ind w:left="3600" w:hanging="360"/>
+      </w:pPr>
+      <w:rPr>
+        <w:rFonts w:ascii="Wingdings" w:hAnsi="Wingdings" w:hint="default"/>
+        <w:sz w:val="20"/>
+      </w:rPr>
+    </w:lvl>
+    <w:lvl w:ilvl="5" w:tentative="1">
+      <w:start w:val="1"/>
+      <w:numFmt w:val="bullet"/>
+      <w:lvlText w:val=""/>
+      <w:lvlJc w:val="left"/>
+      <w:pPr>
+        <w:tabs>
+          <w:tab w:val="num" w:pos="4320"/>
+        </w:tabs>
+        <w:ind w:left="4320" w:hanging="360"/>
+      </w:pPr>
+      <w:rPr>
+        <w:rFonts w:ascii="Wingdings" w:hAnsi="Wingdings" w:hint="default"/>
+        <w:sz w:val="20"/>
+      </w:rPr>
+    </w:lvl>
+    <w:lvl w:ilvl="6" w:tentative="1">
+      <w:start w:val="1"/>
+      <w:numFmt w:val="bullet"/>
+      <w:lvlText w:val=""/>
+      <w:lvlJc w:val="left"/>
+      <w:pPr>
+        <w:tabs>
+          <w:tab w:val="num" w:pos="5040"/>
+        </w:tabs>
+        <w:ind w:left="5040" w:hanging="360"/>
+      </w:pPr>
+      <w:rPr>
+        <w:rFonts w:ascii="Wingdings" w:hAnsi="Wingdings" w:hint="default"/>
+        <w:sz w:val="20"/>
+      </w:rPr>
+    </w:lvl>
+    <w:lvl w:ilvl="7" w:tentative="1">
+      <w:start w:val="1"/>
+      <w:numFmt w:val="bullet"/>
+      <w:lvlText w:val=""/>
+      <w:lvlJc w:val="left"/>
+      <w:pPr>
+        <w:tabs>
+          <w:tab w:val="num" w:pos="5760"/>
+        </w:tabs>
+        <w:ind w:left="5760" w:hanging="360"/>
+      </w:pPr>
+      <w:rPr>
+        <w:rFonts w:ascii="Wingdings" w:hAnsi="Wingdings" w:hint="default"/>
+        <w:sz w:val="20"/>
+      </w:rPr>
+    </w:lvl>
+    <w:lvl w:ilvl="8" w:tentative="1">
+      <w:start w:val="1"/>
+      <w:numFmt w:val="bullet"/>
+      <w:lvlText w:val=""/>
+      <w:lvlJc w:val="left"/>
+      <w:pPr>
+        <w:tabs>
+          <w:tab w:val="num" w:pos="6480"/>
+        </w:tabs>
+        <w:ind w:left="6480" w:hanging="360"/>
+      </w:pPr>
+      <w:rPr>
+        <w:rFonts w:ascii="Wingdings" w:hAnsi="Wingdings" w:hint="default"/>
+        <w:sz w:val="20"/>
+      </w:rPr>
+    </w:lvl>
+  </w:abstractNum>
+  <w:abstractNum w:abstractNumId="1" w15:restartNumberingAfterBreak="0">
+    <w:nsid w:val="10246E4B"/>
+    <w:multiLevelType w:val="hybridMultilevel"/>
+    <w:tmpl w:val="9438A60C"/>
+    <w:lvl w:ilvl="0" w:tplc="0409000F">
+      <w:start w:val="1"/>
+      <w:numFmt w:val="decimal"/>
+      <w:lvlText w:val="%1."/>
+      <w:lvlJc w:val="left"/>
+      <w:pPr>
+        <w:ind w:left="720" w:hanging="360"/>
+      </w:pPr>
+      <w:rPr>
+        <w:rFonts w:hint="default"/>
+      </w:rPr>
+    </w:lvl>
+    <w:lvl w:ilvl="1" w:tplc="04090019" w:tentative="1">
+      <w:start w:val="1"/>
+      <w:numFmt w:val="lowerLetter"/>
+      <w:lvlText w:val="%2."/>
+      <w:lvlJc w:val="left"/>
+      <w:pPr>
+        <w:ind w:left="1440" w:hanging="360"/>
+      </w:pPr>
+    </w:lvl>
+    <w:lvl w:ilvl="2" w:tplc="0409001B" w:tentative="1">
+      <w:start w:val="1"/>
+      <w:numFmt w:val="lowerRoman"/>
+      <w:lvlText w:val="%3."/>
+      <w:lvlJc w:val="right"/>
+      <w:pPr>
+        <w:ind w:left="2160" w:hanging="180"/>
+      </w:pPr>
+    </w:lvl>
+    <w:lvl w:ilvl="3" w:tplc="0409000F" w:tentative="1">
+      <w:start w:val="1"/>
+      <w:numFmt w:val="decimal"/>
+      <w:lvlText w:val="%4."/>
+      <w:lvlJc w:val="left"/>
+      <w:pPr>
+        <w:ind w:left="2880" w:hanging="360"/>
+      </w:pPr>
+    </w:lvl>
+    <w:lvl w:ilvl="4" w:tplc="04090019" w:tentative="1">
+      <w:start w:val="1"/>
+      <w:numFmt w:val="lowerLetter"/>
+      <w:lvlText w:val="%5."/>
+      <w:lvlJc w:val="left"/>
+      <w:pPr>
+        <w:ind w:left="3600" w:hanging="360"/>
+      </w:pPr>
+    </w:lvl>
+    <w:lvl w:ilvl="5" w:tplc="0409001B" w:tentative="1">
+      <w:start w:val="1"/>
+      <w:numFmt w:val="lowerRoman"/>
+      <w:lvlText w:val="%6."/>
+      <w:lvlJc w:val="right"/>
+      <w:pPr>
+        <w:ind w:left="4320" w:hanging="180"/>
+      </w:pPr>
+    </w:lvl>
+    <w:lvl w:ilvl="6" w:tplc="0409000F" w:tentative="1">
+      <w:start w:val="1"/>
+      <w:numFmt w:val="decimal"/>
+      <w:lvlText w:val="%7."/>
+      <w:lvlJc w:val="left"/>
+      <w:pPr>
+        <w:ind w:left="5040" w:hanging="360"/>
+      </w:pPr>
+    </w:lvl>
+    <w:lvl w:ilvl="7" w:tplc="04090019" w:tentative="1">
+      <w:start w:val="1"/>
+      <w:numFmt w:val="lowerLetter"/>
+      <w:lvlText w:val="%8."/>
+      <w:lvlJc w:val="left"/>
+      <w:pPr>
+        <w:ind w:left="5760" w:hanging="360"/>
+      </w:pPr>
+    </w:lvl>
+    <w:lvl w:ilvl="8" w:tplc="0409001B" w:tentative="1">
+      <w:start w:val="1"/>
+      <w:numFmt w:val="lowerRoman"/>
+      <w:lvlText w:val="%9."/>
+      <w:lvlJc w:val="right"/>
+      <w:pPr>
+        <w:ind w:left="6480" w:hanging="180"/>
+      </w:pPr>
+    </w:lvl>
+  </w:abstractNum>
+  <w:abstractNum w:abstractNumId="2" w15:restartNumberingAfterBreak="0">
+    <w:nsid w:val="11C01F08"/>
+    <w:multiLevelType w:val="hybridMultilevel"/>
+    <w:tmpl w:val="74289900"/>
+    <w:lvl w:ilvl="0" w:tplc="0409000F">
+      <w:start w:val="1"/>
+      <w:numFmt w:val="decimal"/>
+      <w:lvlText w:val="%1."/>
+      <w:lvlJc w:val="left"/>
+      <w:pPr>
+        <w:ind w:left="720" w:hanging="360"/>
+      </w:pPr>
+      <w:rPr>
+        <w:rFonts w:hint="default"/>
+      </w:rPr>
+    </w:lvl>
+    <w:lvl w:ilvl="1" w:tplc="04090019" w:tentative="1">
+      <w:start w:val="1"/>
+      <w:numFmt w:val="lowerLetter"/>
+      <w:lvlText w:val="%2."/>
+      <w:lvlJc w:val="left"/>
+      <w:pPr>
+        <w:ind w:left="1440" w:hanging="360"/>
+      </w:pPr>
+    </w:lvl>
+    <w:lvl w:ilvl="2" w:tplc="0409001B" w:tentative="1">
+      <w:start w:val="1"/>
+      <w:numFmt w:val="lowerRoman"/>
+      <w:lvlText w:val="%3."/>
+      <w:lvlJc w:val="right"/>
+      <w:pPr>
+        <w:ind w:left="2160" w:hanging="180"/>
+      </w:pPr>
+    </w:lvl>
+    <w:lvl w:ilvl="3" w:tplc="0409000F" w:tentative="1">
+      <w:start w:val="1"/>
+      <w:numFmt w:val="decimal"/>
+      <w:lvlText w:val="%4."/>
+      <w:lvlJc w:val="left"/>
+      <w:pPr>
+        <w:ind w:left="2880" w:hanging="360"/>
+      </w:pPr>
+    </w:lvl>
+    <w:lvl w:ilvl="4" w:tplc="04090019" w:tentative="1">
+      <w:start w:val="1"/>
+      <w:numFmt w:val="lowerLetter"/>
+      <w:lvlText w:val="%5."/>
+      <w:lvlJc w:val="left"/>
+      <w:pPr>
+        <w:ind w:left="3600" w:hanging="360"/>
+      </w:pPr>
+    </w:lvl>
+    <w:lvl w:ilvl="5" w:tplc="0409001B" w:tentative="1">
+      <w:start w:val="1"/>
+      <w:numFmt w:val="lowerRoman"/>
+      <w:lvlText w:val="%6."/>
+      <w:lvlJc w:val="right"/>
+      <w:pPr>
+        <w:ind w:left="4320" w:hanging="180"/>
+      </w:pPr>
+    </w:lvl>
+    <w:lvl w:ilvl="6" w:tplc="0409000F" w:tentative="1">
+      <w:start w:val="1"/>
+      <w:numFmt w:val="decimal"/>
+      <w:lvlText w:val="%7."/>
+      <w:lvlJc w:val="left"/>
+      <w:pPr>
+        <w:ind w:left="5040" w:hanging="360"/>
+      </w:pPr>
+    </w:lvl>
+    <w:lvl w:ilvl="7" w:tplc="04090019" w:tentative="1">
+      <w:start w:val="1"/>
+      <w:numFmt w:val="lowerLetter"/>
+      <w:lvlText w:val="%8."/>
+      <w:lvlJc w:val="left"/>
+      <w:pPr>
+        <w:ind w:left="5760" w:hanging="360"/>
+      </w:pPr>
+    </w:lvl>
+    <w:lvl w:ilvl="8" w:tplc="0409001B" w:tentative="1">
+      <w:start w:val="1"/>
+      <w:numFmt w:val="lowerRoman"/>
+      <w:lvlText w:val="%9."/>
+      <w:lvlJc w:val="right"/>
+      <w:pPr>
+        <w:ind w:left="6480" w:hanging="180"/>
+      </w:pPr>
+    </w:lvl>
+  </w:abstractNum>
+  <w:abstractNum w:abstractNumId="3" w15:restartNumberingAfterBreak="0">
     <w:nsid w:val="1301333A"/>
     <w:multiLevelType w:val="hybridMultilevel"/>
     <w:tmpl w:val="BB148322"/>
@@ -8831,7 +11573,7 @@
       </w:pPr>
     </w:lvl>
   </w:abstractNum>
-  <w:abstractNum w:abstractNumId="1" w15:restartNumberingAfterBreak="0">
+  <w:abstractNum w:abstractNumId="4" w15:restartNumberingAfterBreak="0">
     <w:nsid w:val="1EF30141"/>
     <w:multiLevelType w:val="hybridMultilevel"/>
     <w:tmpl w:val="CFB29D06"/>
@@ -8944,7 +11686,156 @@
       </w:rPr>
     </w:lvl>
   </w:abstractNum>
-  <w:abstractNum w:abstractNumId="2" w15:restartNumberingAfterBreak="0">
+  <w:abstractNum w:abstractNumId="5" w15:restartNumberingAfterBreak="0">
+    <w:nsid w:val="3E021F83"/>
+    <w:multiLevelType w:val="multilevel"/>
+    <w:tmpl w:val="42B6D414"/>
+    <w:lvl w:ilvl="0">
+      <w:start w:val="1"/>
+      <w:numFmt w:val="bullet"/>
+      <w:lvlText w:val=""/>
+      <w:lvlJc w:val="left"/>
+      <w:pPr>
+        <w:tabs>
+          <w:tab w:val="num" w:pos="720"/>
+        </w:tabs>
+        <w:ind w:left="720" w:hanging="360"/>
+      </w:pPr>
+      <w:rPr>
+        <w:rFonts w:ascii="Symbol" w:hAnsi="Symbol" w:hint="default"/>
+        <w:sz w:val="20"/>
+      </w:rPr>
+    </w:lvl>
+    <w:lvl w:ilvl="1" w:tentative="1">
+      <w:start w:val="1"/>
+      <w:numFmt w:val="bullet"/>
+      <w:lvlText w:val="o"/>
+      <w:lvlJc w:val="left"/>
+      <w:pPr>
+        <w:tabs>
+          <w:tab w:val="num" w:pos="1440"/>
+        </w:tabs>
+        <w:ind w:left="1440" w:hanging="360"/>
+      </w:pPr>
+      <w:rPr>
+        <w:rFonts w:ascii="Courier New" w:hAnsi="Courier New" w:hint="default"/>
+        <w:sz w:val="20"/>
+      </w:rPr>
+    </w:lvl>
+    <w:lvl w:ilvl="2" w:tentative="1">
+      <w:start w:val="1"/>
+      <w:numFmt w:val="bullet"/>
+      <w:lvlText w:val=""/>
+      <w:lvlJc w:val="left"/>
+      <w:pPr>
+        <w:tabs>
+          <w:tab w:val="num" w:pos="2160"/>
+        </w:tabs>
+        <w:ind w:left="2160" w:hanging="360"/>
+      </w:pPr>
+      <w:rPr>
+        <w:rFonts w:ascii="Wingdings" w:hAnsi="Wingdings" w:hint="default"/>
+        <w:sz w:val="20"/>
+      </w:rPr>
+    </w:lvl>
+    <w:lvl w:ilvl="3" w:tentative="1">
+      <w:start w:val="1"/>
+      <w:numFmt w:val="bullet"/>
+      <w:lvlText w:val=""/>
+      <w:lvlJc w:val="left"/>
+      <w:pPr>
+        <w:tabs>
+          <w:tab w:val="num" w:pos="2880"/>
+        </w:tabs>
+        <w:ind w:left="2880" w:hanging="360"/>
+      </w:pPr>
+      <w:rPr>
+        <w:rFonts w:ascii="Wingdings" w:hAnsi="Wingdings" w:hint="default"/>
+        <w:sz w:val="20"/>
+      </w:rPr>
+    </w:lvl>
+    <w:lvl w:ilvl="4" w:tentative="1">
+      <w:start w:val="1"/>
+      <w:numFmt w:val="bullet"/>
+      <w:lvlText w:val=""/>
+      <w:lvlJc w:val="left"/>
+      <w:pPr>
+        <w:tabs>
+          <w:tab w:val="num" w:pos="3600"/>
+        </w:tabs>
+        <w:ind w:left="3600" w:hanging="360"/>
+      </w:pPr>
+      <w:rPr>
+        <w:rFonts w:ascii="Wingdings" w:hAnsi="Wingdings" w:hint="default"/>
+        <w:sz w:val="20"/>
+      </w:rPr>
+    </w:lvl>
+    <w:lvl w:ilvl="5" w:tentative="1">
+      <w:start w:val="1"/>
+      <w:numFmt w:val="bullet"/>
+      <w:lvlText w:val=""/>
+      <w:lvlJc w:val="left"/>
+      <w:pPr>
+        <w:tabs>
+          <w:tab w:val="num" w:pos="4320"/>
+        </w:tabs>
+        <w:ind w:left="4320" w:hanging="360"/>
+      </w:pPr>
+      <w:rPr>
+        <w:rFonts w:ascii="Wingdings" w:hAnsi="Wingdings" w:hint="default"/>
+        <w:sz w:val="20"/>
+      </w:rPr>
+    </w:lvl>
+    <w:lvl w:ilvl="6" w:tentative="1">
+      <w:start w:val="1"/>
+      <w:numFmt w:val="bullet"/>
+      <w:lvlText w:val=""/>
+      <w:lvlJc w:val="left"/>
+      <w:pPr>
+        <w:tabs>
+          <w:tab w:val="num" w:pos="5040"/>
+        </w:tabs>
+        <w:ind w:left="5040" w:hanging="360"/>
+      </w:pPr>
+      <w:rPr>
+        <w:rFonts w:ascii="Wingdings" w:hAnsi="Wingdings" w:hint="default"/>
+        <w:sz w:val="20"/>
+      </w:rPr>
+    </w:lvl>
+    <w:lvl w:ilvl="7" w:tentative="1">
+      <w:start w:val="1"/>
+      <w:numFmt w:val="bullet"/>
+      <w:lvlText w:val=""/>
+      <w:lvlJc w:val="left"/>
+      <w:pPr>
+        <w:tabs>
+          <w:tab w:val="num" w:pos="5760"/>
+        </w:tabs>
+        <w:ind w:left="5760" w:hanging="360"/>
+      </w:pPr>
+      <w:rPr>
+        <w:rFonts w:ascii="Wingdings" w:hAnsi="Wingdings" w:hint="default"/>
+        <w:sz w:val="20"/>
+      </w:rPr>
+    </w:lvl>
+    <w:lvl w:ilvl="8" w:tentative="1">
+      <w:start w:val="1"/>
+      <w:numFmt w:val="bullet"/>
+      <w:lvlText w:val=""/>
+      <w:lvlJc w:val="left"/>
+      <w:pPr>
+        <w:tabs>
+          <w:tab w:val="num" w:pos="6480"/>
+        </w:tabs>
+        <w:ind w:left="6480" w:hanging="360"/>
+      </w:pPr>
+      <w:rPr>
+        <w:rFonts w:ascii="Wingdings" w:hAnsi="Wingdings" w:hint="default"/>
+        <w:sz w:val="20"/>
+      </w:rPr>
+    </w:lvl>
+  </w:abstractNum>
+  <w:abstractNum w:abstractNumId="6" w15:restartNumberingAfterBreak="0">
     <w:nsid w:val="402E729D"/>
     <w:multiLevelType w:val="multilevel"/>
     <w:tmpl w:val="96A00EFA"/>
@@ -9093,14 +11984,362 @@
       </w:rPr>
     </w:lvl>
   </w:abstractNum>
+  <w:abstractNum w:abstractNumId="7" w15:restartNumberingAfterBreak="0">
+    <w:nsid w:val="6D400293"/>
+    <w:multiLevelType w:val="hybridMultilevel"/>
+    <w:tmpl w:val="08E6AC6E"/>
+    <w:lvl w:ilvl="0" w:tplc="0409000F">
+      <w:start w:val="1"/>
+      <w:numFmt w:val="decimal"/>
+      <w:lvlText w:val="%1."/>
+      <w:lvlJc w:val="left"/>
+      <w:pPr>
+        <w:ind w:left="720" w:hanging="360"/>
+      </w:pPr>
+      <w:rPr>
+        <w:rFonts w:hint="default"/>
+      </w:rPr>
+    </w:lvl>
+    <w:lvl w:ilvl="1" w:tplc="04090019" w:tentative="1">
+      <w:start w:val="1"/>
+      <w:numFmt w:val="lowerLetter"/>
+      <w:lvlText w:val="%2."/>
+      <w:lvlJc w:val="left"/>
+      <w:pPr>
+        <w:ind w:left="1440" w:hanging="360"/>
+      </w:pPr>
+    </w:lvl>
+    <w:lvl w:ilvl="2" w:tplc="0409001B" w:tentative="1">
+      <w:start w:val="1"/>
+      <w:numFmt w:val="lowerRoman"/>
+      <w:lvlText w:val="%3."/>
+      <w:lvlJc w:val="right"/>
+      <w:pPr>
+        <w:ind w:left="2160" w:hanging="180"/>
+      </w:pPr>
+    </w:lvl>
+    <w:lvl w:ilvl="3" w:tplc="0409000F" w:tentative="1">
+      <w:start w:val="1"/>
+      <w:numFmt w:val="decimal"/>
+      <w:lvlText w:val="%4."/>
+      <w:lvlJc w:val="left"/>
+      <w:pPr>
+        <w:ind w:left="2880" w:hanging="360"/>
+      </w:pPr>
+    </w:lvl>
+    <w:lvl w:ilvl="4" w:tplc="04090019" w:tentative="1">
+      <w:start w:val="1"/>
+      <w:numFmt w:val="lowerLetter"/>
+      <w:lvlText w:val="%5."/>
+      <w:lvlJc w:val="left"/>
+      <w:pPr>
+        <w:ind w:left="3600" w:hanging="360"/>
+      </w:pPr>
+    </w:lvl>
+    <w:lvl w:ilvl="5" w:tplc="0409001B" w:tentative="1">
+      <w:start w:val="1"/>
+      <w:numFmt w:val="lowerRoman"/>
+      <w:lvlText w:val="%6."/>
+      <w:lvlJc w:val="right"/>
+      <w:pPr>
+        <w:ind w:left="4320" w:hanging="180"/>
+      </w:pPr>
+    </w:lvl>
+    <w:lvl w:ilvl="6" w:tplc="0409000F" w:tentative="1">
+      <w:start w:val="1"/>
+      <w:numFmt w:val="decimal"/>
+      <w:lvlText w:val="%7."/>
+      <w:lvlJc w:val="left"/>
+      <w:pPr>
+        <w:ind w:left="5040" w:hanging="360"/>
+      </w:pPr>
+    </w:lvl>
+    <w:lvl w:ilvl="7" w:tplc="04090019" w:tentative="1">
+      <w:start w:val="1"/>
+      <w:numFmt w:val="lowerLetter"/>
+      <w:lvlText w:val="%8."/>
+      <w:lvlJc w:val="left"/>
+      <w:pPr>
+        <w:ind w:left="5760" w:hanging="360"/>
+      </w:pPr>
+    </w:lvl>
+    <w:lvl w:ilvl="8" w:tplc="0409001B" w:tentative="1">
+      <w:start w:val="1"/>
+      <w:numFmt w:val="lowerRoman"/>
+      <w:lvlText w:val="%9."/>
+      <w:lvlJc w:val="right"/>
+      <w:pPr>
+        <w:ind w:left="6480" w:hanging="180"/>
+      </w:pPr>
+    </w:lvl>
+  </w:abstractNum>
+  <w:abstractNum w:abstractNumId="8" w15:restartNumberingAfterBreak="0">
+    <w:nsid w:val="6DCD2F14"/>
+    <w:multiLevelType w:val="multilevel"/>
+    <w:tmpl w:val="9BDCDDE6"/>
+    <w:lvl w:ilvl="0">
+      <w:start w:val="1"/>
+      <w:numFmt w:val="bullet"/>
+      <w:lvlText w:val=""/>
+      <w:lvlJc w:val="left"/>
+      <w:pPr>
+        <w:tabs>
+          <w:tab w:val="num" w:pos="720"/>
+        </w:tabs>
+        <w:ind w:left="720" w:hanging="360"/>
+      </w:pPr>
+      <w:rPr>
+        <w:rFonts w:ascii="Symbol" w:hAnsi="Symbol" w:hint="default"/>
+        <w:sz w:val="20"/>
+      </w:rPr>
+    </w:lvl>
+    <w:lvl w:ilvl="1" w:tentative="1">
+      <w:start w:val="1"/>
+      <w:numFmt w:val="bullet"/>
+      <w:lvlText w:val="o"/>
+      <w:lvlJc w:val="left"/>
+      <w:pPr>
+        <w:tabs>
+          <w:tab w:val="num" w:pos="1440"/>
+        </w:tabs>
+        <w:ind w:left="1440" w:hanging="360"/>
+      </w:pPr>
+      <w:rPr>
+        <w:rFonts w:ascii="Courier New" w:hAnsi="Courier New" w:hint="default"/>
+        <w:sz w:val="20"/>
+      </w:rPr>
+    </w:lvl>
+    <w:lvl w:ilvl="2" w:tentative="1">
+      <w:start w:val="1"/>
+      <w:numFmt w:val="bullet"/>
+      <w:lvlText w:val=""/>
+      <w:lvlJc w:val="left"/>
+      <w:pPr>
+        <w:tabs>
+          <w:tab w:val="num" w:pos="2160"/>
+        </w:tabs>
+        <w:ind w:left="2160" w:hanging="360"/>
+      </w:pPr>
+      <w:rPr>
+        <w:rFonts w:ascii="Wingdings" w:hAnsi="Wingdings" w:hint="default"/>
+        <w:sz w:val="20"/>
+      </w:rPr>
+    </w:lvl>
+    <w:lvl w:ilvl="3" w:tentative="1">
+      <w:start w:val="1"/>
+      <w:numFmt w:val="bullet"/>
+      <w:lvlText w:val=""/>
+      <w:lvlJc w:val="left"/>
+      <w:pPr>
+        <w:tabs>
+          <w:tab w:val="num" w:pos="2880"/>
+        </w:tabs>
+        <w:ind w:left="2880" w:hanging="360"/>
+      </w:pPr>
+      <w:rPr>
+        <w:rFonts w:ascii="Wingdings" w:hAnsi="Wingdings" w:hint="default"/>
+        <w:sz w:val="20"/>
+      </w:rPr>
+    </w:lvl>
+    <w:lvl w:ilvl="4" w:tentative="1">
+      <w:start w:val="1"/>
+      <w:numFmt w:val="bullet"/>
+      <w:lvlText w:val=""/>
+      <w:lvlJc w:val="left"/>
+      <w:pPr>
+        <w:tabs>
+          <w:tab w:val="num" w:pos="3600"/>
+        </w:tabs>
+        <w:ind w:left="3600" w:hanging="360"/>
+      </w:pPr>
+      <w:rPr>
+        <w:rFonts w:ascii="Wingdings" w:hAnsi="Wingdings" w:hint="default"/>
+        <w:sz w:val="20"/>
+      </w:rPr>
+    </w:lvl>
+    <w:lvl w:ilvl="5" w:tentative="1">
+      <w:start w:val="1"/>
+      <w:numFmt w:val="bullet"/>
+      <w:lvlText w:val=""/>
+      <w:lvlJc w:val="left"/>
+      <w:pPr>
+        <w:tabs>
+          <w:tab w:val="num" w:pos="4320"/>
+        </w:tabs>
+        <w:ind w:left="4320" w:hanging="360"/>
+      </w:pPr>
+      <w:rPr>
+        <w:rFonts w:ascii="Wingdings" w:hAnsi="Wingdings" w:hint="default"/>
+        <w:sz w:val="20"/>
+      </w:rPr>
+    </w:lvl>
+    <w:lvl w:ilvl="6" w:tentative="1">
+      <w:start w:val="1"/>
+      <w:numFmt w:val="bullet"/>
+      <w:lvlText w:val=""/>
+      <w:lvlJc w:val="left"/>
+      <w:pPr>
+        <w:tabs>
+          <w:tab w:val="num" w:pos="5040"/>
+        </w:tabs>
+        <w:ind w:left="5040" w:hanging="360"/>
+      </w:pPr>
+      <w:rPr>
+        <w:rFonts w:ascii="Wingdings" w:hAnsi="Wingdings" w:hint="default"/>
+        <w:sz w:val="20"/>
+      </w:rPr>
+    </w:lvl>
+    <w:lvl w:ilvl="7" w:tentative="1">
+      <w:start w:val="1"/>
+      <w:numFmt w:val="bullet"/>
+      <w:lvlText w:val=""/>
+      <w:lvlJc w:val="left"/>
+      <w:pPr>
+        <w:tabs>
+          <w:tab w:val="num" w:pos="5760"/>
+        </w:tabs>
+        <w:ind w:left="5760" w:hanging="360"/>
+      </w:pPr>
+      <w:rPr>
+        <w:rFonts w:ascii="Wingdings" w:hAnsi="Wingdings" w:hint="default"/>
+        <w:sz w:val="20"/>
+      </w:rPr>
+    </w:lvl>
+    <w:lvl w:ilvl="8" w:tentative="1">
+      <w:start w:val="1"/>
+      <w:numFmt w:val="bullet"/>
+      <w:lvlText w:val=""/>
+      <w:lvlJc w:val="left"/>
+      <w:pPr>
+        <w:tabs>
+          <w:tab w:val="num" w:pos="6480"/>
+        </w:tabs>
+        <w:ind w:left="6480" w:hanging="360"/>
+      </w:pPr>
+      <w:rPr>
+        <w:rFonts w:ascii="Wingdings" w:hAnsi="Wingdings" w:hint="default"/>
+        <w:sz w:val="20"/>
+      </w:rPr>
+    </w:lvl>
+  </w:abstractNum>
+  <w:abstractNum w:abstractNumId="9" w15:restartNumberingAfterBreak="0">
+    <w:nsid w:val="6F211096"/>
+    <w:multiLevelType w:val="hybridMultilevel"/>
+    <w:tmpl w:val="54F486CA"/>
+    <w:lvl w:ilvl="0" w:tplc="0409000F">
+      <w:start w:val="1"/>
+      <w:numFmt w:val="decimal"/>
+      <w:lvlText w:val="%1."/>
+      <w:lvlJc w:val="left"/>
+      <w:pPr>
+        <w:ind w:left="720" w:hanging="360"/>
+      </w:pPr>
+      <w:rPr>
+        <w:rFonts w:hint="default"/>
+      </w:rPr>
+    </w:lvl>
+    <w:lvl w:ilvl="1" w:tplc="04090019" w:tentative="1">
+      <w:start w:val="1"/>
+      <w:numFmt w:val="lowerLetter"/>
+      <w:lvlText w:val="%2."/>
+      <w:lvlJc w:val="left"/>
+      <w:pPr>
+        <w:ind w:left="1440" w:hanging="360"/>
+      </w:pPr>
+    </w:lvl>
+    <w:lvl w:ilvl="2" w:tplc="0409001B" w:tentative="1">
+      <w:start w:val="1"/>
+      <w:numFmt w:val="lowerRoman"/>
+      <w:lvlText w:val="%3."/>
+      <w:lvlJc w:val="right"/>
+      <w:pPr>
+        <w:ind w:left="2160" w:hanging="180"/>
+      </w:pPr>
+    </w:lvl>
+    <w:lvl w:ilvl="3" w:tplc="0409000F" w:tentative="1">
+      <w:start w:val="1"/>
+      <w:numFmt w:val="decimal"/>
+      <w:lvlText w:val="%4."/>
+      <w:lvlJc w:val="left"/>
+      <w:pPr>
+        <w:ind w:left="2880" w:hanging="360"/>
+      </w:pPr>
+    </w:lvl>
+    <w:lvl w:ilvl="4" w:tplc="04090019" w:tentative="1">
+      <w:start w:val="1"/>
+      <w:numFmt w:val="lowerLetter"/>
+      <w:lvlText w:val="%5."/>
+      <w:lvlJc w:val="left"/>
+      <w:pPr>
+        <w:ind w:left="3600" w:hanging="360"/>
+      </w:pPr>
+    </w:lvl>
+    <w:lvl w:ilvl="5" w:tplc="0409001B" w:tentative="1">
+      <w:start w:val="1"/>
+      <w:numFmt w:val="lowerRoman"/>
+      <w:lvlText w:val="%6."/>
+      <w:lvlJc w:val="right"/>
+      <w:pPr>
+        <w:ind w:left="4320" w:hanging="180"/>
+      </w:pPr>
+    </w:lvl>
+    <w:lvl w:ilvl="6" w:tplc="0409000F" w:tentative="1">
+      <w:start w:val="1"/>
+      <w:numFmt w:val="decimal"/>
+      <w:lvlText w:val="%7."/>
+      <w:lvlJc w:val="left"/>
+      <w:pPr>
+        <w:ind w:left="5040" w:hanging="360"/>
+      </w:pPr>
+    </w:lvl>
+    <w:lvl w:ilvl="7" w:tplc="04090019" w:tentative="1">
+      <w:start w:val="1"/>
+      <w:numFmt w:val="lowerLetter"/>
+      <w:lvlText w:val="%8."/>
+      <w:lvlJc w:val="left"/>
+      <w:pPr>
+        <w:ind w:left="5760" w:hanging="360"/>
+      </w:pPr>
+    </w:lvl>
+    <w:lvl w:ilvl="8" w:tplc="0409001B" w:tentative="1">
+      <w:start w:val="1"/>
+      <w:numFmt w:val="lowerRoman"/>
+      <w:lvlText w:val="%9."/>
+      <w:lvlJc w:val="right"/>
+      <w:pPr>
+        <w:ind w:left="6480" w:hanging="180"/>
+      </w:pPr>
+    </w:lvl>
+  </w:abstractNum>
   <w:num w:numId="1" w16cid:durableId="1846020838">
+    <w:abstractNumId w:val="4"/>
+  </w:num>
+  <w:num w:numId="2" w16cid:durableId="155925639">
+    <w:abstractNumId w:val="3"/>
+  </w:num>
+  <w:num w:numId="3" w16cid:durableId="2022320150">
+    <w:abstractNumId w:val="6"/>
+  </w:num>
+  <w:num w:numId="4" w16cid:durableId="893928914">
     <w:abstractNumId w:val="1"/>
   </w:num>
-  <w:num w:numId="2" w16cid:durableId="155925639">
+  <w:num w:numId="5" w16cid:durableId="1386487200">
+    <w:abstractNumId w:val="9"/>
+  </w:num>
+  <w:num w:numId="6" w16cid:durableId="147869777">
+    <w:abstractNumId w:val="7"/>
+  </w:num>
+  <w:num w:numId="7" w16cid:durableId="1281913124">
+    <w:abstractNumId w:val="2"/>
+  </w:num>
+  <w:num w:numId="8" w16cid:durableId="1485659390">
+    <w:abstractNumId w:val="5"/>
+  </w:num>
+  <w:num w:numId="9" w16cid:durableId="112674466">
     <w:abstractNumId w:val="0"/>
   </w:num>
-  <w:num w:numId="3" w16cid:durableId="2022320150">
-    <w:abstractNumId w:val="2"/>
+  <w:num w:numId="10" w16cid:durableId="950430666">
+    <w:abstractNumId w:val="8"/>
   </w:num>
 </w:numbering>
 </file>
@@ -9708,7 +12947,6 @@
   <w:style w:type="character" w:default="1" w:styleId="DefaultParagraphFont">
     <w:name w:val="Default Paragraph Font"/>
     <w:uiPriority w:val="1"/>
-    <w:semiHidden/>
     <w:unhideWhenUsed/>
   </w:style>
   <w:style w:type="table" w:default="1" w:styleId="TableNormal">
@@ -10259,6 +13497,29 @@
       <w:rFonts w:ascii="Times New Roman" w:hAnsi="Times New Roman" w:cs="Times New Roman"/>
     </w:rPr>
   </w:style>
+  <w:style w:type="character" w:styleId="Hyperlink">
+    <w:name w:val="Hyperlink"/>
+    <w:basedOn w:val="DefaultParagraphFont"/>
+    <w:uiPriority w:val="99"/>
+    <w:unhideWhenUsed/>
+    <w:rsid w:val="00AB4D43"/>
+    <w:rPr>
+      <w:color w:val="467886" w:themeColor="hyperlink"/>
+      <w:u w:val="single"/>
+    </w:rPr>
+  </w:style>
+  <w:style w:type="character" w:styleId="UnresolvedMention">
+    <w:name w:val="Unresolved Mention"/>
+    <w:basedOn w:val="DefaultParagraphFont"/>
+    <w:uiPriority w:val="99"/>
+    <w:semiHidden/>
+    <w:unhideWhenUsed/>
+    <w:rsid w:val="00AB4D43"/>
+    <w:rPr>
+      <w:color w:val="605E5C"/>
+      <w:shd w:val="clear" w:color="auto" w:fill="E1DFDD"/>
+    </w:rPr>
+  </w:style>
 </w:styles>
 </file>
 

</xml_diff>